<commit_message>
Inventory list: remove Remarks column (detail folded into item text)
Co-Authored-By: Claude Opus 4.8 <noreply@anthropic.com>
Claude-Session: https://claude.ai/code/session_01WYLXC9uaFEEBGfEAmw5PKy
</commit_message>
<xml_diff>
--- a/Inventory_List_B18-01_HijauanKiara_ATP.docx
+++ b/Inventory_List_B18-01_HijauanKiara_ATP.docx
@@ -37,14 +37,13 @@
         <w:tblLook w:firstColumn="1" w:firstRow="1" w:lastColumn="0" w:lastRow="0" w:noHBand="0" w:noVBand="1" w:val="04A0"/>
       </w:tblPr>
       <w:tblGrid>
-        <w:gridCol w:w="3408"/>
-        <w:gridCol w:w="3408"/>
-        <w:gridCol w:w="3408"/>
+        <w:gridCol w:w="5112"/>
+        <w:gridCol w:w="5112"/>
       </w:tblGrid>
       <w:tr>
         <w:tc>
           <w:tcPr>
-            <w:tcW w:type="dxa" w:w="5760"/>
+            <w:tcW w:type="dxa" w:w="8064"/>
             <w:vAlign w:val="center"/>
             <w:shd w:val="clear" w:fill="12263A"/>
           </w:tcPr>
@@ -62,7 +61,7 @@
         </w:tc>
         <w:tc>
           <w:tcPr>
-            <w:tcW w:type="dxa" w:w="1152"/>
+            <w:tcW w:type="dxa" w:w="1296"/>
             <w:vAlign w:val="center"/>
             <w:shd w:val="clear" w:fill="12263A"/>
           </w:tcPr>
@@ -81,33 +80,12 @@
             </w:r>
           </w:p>
         </w:tc>
-        <w:tc>
-          <w:tcPr>
-            <w:tcW w:type="dxa" w:w="3456"/>
-            <w:vAlign w:val="center"/>
-            <w:shd w:val="clear" w:fill="12263A"/>
-          </w:tcPr>
-          <w:p>
-            <w:pPr>
-              <w:jc w:val="center"/>
-            </w:pPr>
-            <w:r>
-              <w:rPr>
-                <w:b/>
-                <w:i w:val="0"/>
-                <w:color w:val="FFFFFF"/>
-                <w:sz w:val="21"/>
-              </w:rPr>
-              <w:t>Remark</w:t>
-            </w:r>
-          </w:p>
-        </w:tc>
       </w:tr>
       <w:tr>
         <w:tc>
           <w:tcPr>
-            <w:tcW w:type="dxa" w:w="10368"/>
-            <w:gridSpan w:val="3"/>
+            <w:tcW w:type="dxa" w:w="9360"/>
+            <w:gridSpan w:val="2"/>
             <w:vAlign w:val="center"/>
             <w:shd w:val="clear" w:fill="DCE6F1"/>
           </w:tcPr>
@@ -127,7 +105,7 @@
       <w:tr>
         <w:tc>
           <w:tcPr>
-            <w:tcW w:type="dxa" w:w="5760"/>
+            <w:tcW w:type="dxa" w:w="8064"/>
             <w:vAlign w:val="center"/>
           </w:tcPr>
           <w:p>
@@ -143,7 +121,7 @@
         </w:tc>
         <w:tc>
           <w:tcPr>
-            <w:tcW w:type="dxa" w:w="1152"/>
+            <w:tcW w:type="dxa" w:w="1296"/>
             <w:vAlign w:val="center"/>
           </w:tcPr>
           <w:p>
@@ -160,26 +138,11 @@
             </w:r>
           </w:p>
         </w:tc>
-        <w:tc>
-          <w:tcPr>
-            <w:tcW w:type="dxa" w:w="3456"/>
-            <w:vAlign w:val="center"/>
-          </w:tcPr>
-          <w:p>
-            <w:r>
-              <w:rPr>
-                <w:b w:val="0"/>
-                <w:i w:val="0"/>
-                <w:sz w:val="18"/>
-              </w:rPr>
-            </w:r>
-          </w:p>
-        </w:tc>
       </w:tr>
       <w:tr>
         <w:tc>
           <w:tcPr>
-            <w:tcW w:type="dxa" w:w="5760"/>
+            <w:tcW w:type="dxa" w:w="8064"/>
             <w:vAlign w:val="center"/>
           </w:tcPr>
           <w:p>
@@ -195,7 +158,7 @@
         </w:tc>
         <w:tc>
           <w:tcPr>
-            <w:tcW w:type="dxa" w:w="1152"/>
+            <w:tcW w:type="dxa" w:w="1296"/>
             <w:vAlign w:val="center"/>
           </w:tcPr>
           <w:p>
@@ -212,26 +175,11 @@
             </w:r>
           </w:p>
         </w:tc>
-        <w:tc>
-          <w:tcPr>
-            <w:tcW w:type="dxa" w:w="3456"/>
-            <w:vAlign w:val="center"/>
-          </w:tcPr>
-          <w:p>
-            <w:r>
-              <w:rPr>
-                <w:b w:val="0"/>
-                <w:i w:val="0"/>
-                <w:sz w:val="18"/>
-              </w:rPr>
-            </w:r>
-          </w:p>
-        </w:tc>
       </w:tr>
       <w:tr>
         <w:tc>
           <w:tcPr>
-            <w:tcW w:type="dxa" w:w="5760"/>
+            <w:tcW w:type="dxa" w:w="8064"/>
             <w:vAlign w:val="center"/>
           </w:tcPr>
           <w:p>
@@ -247,7 +195,7 @@
         </w:tc>
         <w:tc>
           <w:tcPr>
-            <w:tcW w:type="dxa" w:w="1152"/>
+            <w:tcW w:type="dxa" w:w="1296"/>
             <w:vAlign w:val="center"/>
           </w:tcPr>
           <w:p>
@@ -264,26 +212,11 @@
             </w:r>
           </w:p>
         </w:tc>
-        <w:tc>
-          <w:tcPr>
-            <w:tcW w:type="dxa" w:w="3456"/>
-            <w:vAlign w:val="center"/>
-          </w:tcPr>
-          <w:p>
-            <w:r>
-              <w:rPr>
-                <w:b w:val="0"/>
-                <w:i w:val="0"/>
-                <w:sz w:val="18"/>
-              </w:rPr>
-            </w:r>
-          </w:p>
-        </w:tc>
       </w:tr>
       <w:tr>
         <w:tc>
           <w:tcPr>
-            <w:tcW w:type="dxa" w:w="5760"/>
+            <w:tcW w:type="dxa" w:w="8064"/>
             <w:vAlign w:val="center"/>
           </w:tcPr>
           <w:p>
@@ -299,7 +232,7 @@
         </w:tc>
         <w:tc>
           <w:tcPr>
-            <w:tcW w:type="dxa" w:w="1152"/>
+            <w:tcW w:type="dxa" w:w="1296"/>
             <w:vAlign w:val="center"/>
           </w:tcPr>
           <w:p>
@@ -316,27 +249,12 @@
             </w:r>
           </w:p>
         </w:tc>
-        <w:tc>
-          <w:tcPr>
-            <w:tcW w:type="dxa" w:w="3456"/>
-            <w:vAlign w:val="center"/>
-          </w:tcPr>
-          <w:p>
-            <w:r>
-              <w:rPr>
-                <w:b w:val="0"/>
-                <w:i w:val="0"/>
-                <w:sz w:val="18"/>
-              </w:rPr>
-            </w:r>
-          </w:p>
-        </w:tc>
       </w:tr>
       <w:tr>
         <w:tc>
           <w:tcPr>
-            <w:tcW w:type="dxa" w:w="10368"/>
-            <w:gridSpan w:val="3"/>
+            <w:tcW w:type="dxa" w:w="9360"/>
+            <w:gridSpan w:val="2"/>
             <w:vAlign w:val="center"/>
             <w:shd w:val="clear" w:fill="DCE6F1"/>
           </w:tcPr>
@@ -356,7 +274,7 @@
       <w:tr>
         <w:tc>
           <w:tcPr>
-            <w:tcW w:type="dxa" w:w="5760"/>
+            <w:tcW w:type="dxa" w:w="8064"/>
             <w:vAlign w:val="center"/>
           </w:tcPr>
           <w:p>
@@ -372,7 +290,7 @@
         </w:tc>
         <w:tc>
           <w:tcPr>
-            <w:tcW w:type="dxa" w:w="1152"/>
+            <w:tcW w:type="dxa" w:w="1296"/>
             <w:vAlign w:val="center"/>
           </w:tcPr>
           <w:p>
@@ -389,26 +307,11 @@
             </w:r>
           </w:p>
         </w:tc>
-        <w:tc>
-          <w:tcPr>
-            <w:tcW w:type="dxa" w:w="3456"/>
-            <w:vAlign w:val="center"/>
-          </w:tcPr>
-          <w:p>
-            <w:r>
-              <w:rPr>
-                <w:b w:val="0"/>
-                <w:i w:val="0"/>
-                <w:sz w:val="18"/>
-              </w:rPr>
-            </w:r>
-          </w:p>
-        </w:tc>
       </w:tr>
       <w:tr>
         <w:tc>
           <w:tcPr>
-            <w:tcW w:type="dxa" w:w="5760"/>
+            <w:tcW w:type="dxa" w:w="8064"/>
             <w:vAlign w:val="center"/>
           </w:tcPr>
           <w:p>
@@ -424,7 +327,7 @@
         </w:tc>
         <w:tc>
           <w:tcPr>
-            <w:tcW w:type="dxa" w:w="1152"/>
+            <w:tcW w:type="dxa" w:w="1296"/>
             <w:vAlign w:val="center"/>
           </w:tcPr>
           <w:p>
@@ -441,26 +344,11 @@
             </w:r>
           </w:p>
         </w:tc>
-        <w:tc>
-          <w:tcPr>
-            <w:tcW w:type="dxa" w:w="3456"/>
-            <w:vAlign w:val="center"/>
-          </w:tcPr>
-          <w:p>
-            <w:r>
-              <w:rPr>
-                <w:b w:val="0"/>
-                <w:i w:val="0"/>
-                <w:sz w:val="18"/>
-              </w:rPr>
-            </w:r>
-          </w:p>
-        </w:tc>
       </w:tr>
       <w:tr>
         <w:tc>
           <w:tcPr>
-            <w:tcW w:type="dxa" w:w="5760"/>
+            <w:tcW w:type="dxa" w:w="8064"/>
             <w:vAlign w:val="center"/>
           </w:tcPr>
           <w:p>
@@ -476,7 +364,7 @@
         </w:tc>
         <w:tc>
           <w:tcPr>
-            <w:tcW w:type="dxa" w:w="1152"/>
+            <w:tcW w:type="dxa" w:w="1296"/>
             <w:vAlign w:val="center"/>
           </w:tcPr>
           <w:p>
@@ -493,27 +381,12 @@
             </w:r>
           </w:p>
         </w:tc>
-        <w:tc>
-          <w:tcPr>
-            <w:tcW w:type="dxa" w:w="3456"/>
-            <w:vAlign w:val="center"/>
-          </w:tcPr>
-          <w:p>
-            <w:r>
-              <w:rPr>
-                <w:b w:val="0"/>
-                <w:i w:val="0"/>
-                <w:sz w:val="18"/>
-              </w:rPr>
-            </w:r>
-          </w:p>
-        </w:tc>
       </w:tr>
       <w:tr>
         <w:tc>
           <w:tcPr>
-            <w:tcW w:type="dxa" w:w="10368"/>
-            <w:gridSpan w:val="3"/>
+            <w:tcW w:type="dxa" w:w="9360"/>
+            <w:gridSpan w:val="2"/>
             <w:vAlign w:val="center"/>
             <w:shd w:val="clear" w:fill="DCE6F1"/>
           </w:tcPr>
@@ -533,7 +406,7 @@
       <w:tr>
         <w:tc>
           <w:tcPr>
-            <w:tcW w:type="dxa" w:w="5760"/>
+            <w:tcW w:type="dxa" w:w="8064"/>
             <w:vAlign w:val="center"/>
           </w:tcPr>
           <w:p>
@@ -549,7 +422,7 @@
         </w:tc>
         <w:tc>
           <w:tcPr>
-            <w:tcW w:type="dxa" w:w="1152"/>
+            <w:tcW w:type="dxa" w:w="1296"/>
             <w:vAlign w:val="center"/>
           </w:tcPr>
           <w:p>
@@ -566,26 +439,11 @@
             </w:r>
           </w:p>
         </w:tc>
-        <w:tc>
-          <w:tcPr>
-            <w:tcW w:type="dxa" w:w="3456"/>
-            <w:vAlign w:val="center"/>
-          </w:tcPr>
-          <w:p>
-            <w:r>
-              <w:rPr>
-                <w:b w:val="0"/>
-                <w:i w:val="0"/>
-                <w:sz w:val="18"/>
-              </w:rPr>
-            </w:r>
-          </w:p>
-        </w:tc>
       </w:tr>
       <w:tr>
         <w:tc>
           <w:tcPr>
-            <w:tcW w:type="dxa" w:w="5760"/>
+            <w:tcW w:type="dxa" w:w="8064"/>
             <w:vAlign w:val="center"/>
           </w:tcPr>
           <w:p>
@@ -601,7 +459,7 @@
         </w:tc>
         <w:tc>
           <w:tcPr>
-            <w:tcW w:type="dxa" w:w="1152"/>
+            <w:tcW w:type="dxa" w:w="1296"/>
             <w:vAlign w:val="center"/>
           </w:tcPr>
           <w:p>
@@ -618,26 +476,11 @@
             </w:r>
           </w:p>
         </w:tc>
-        <w:tc>
-          <w:tcPr>
-            <w:tcW w:type="dxa" w:w="3456"/>
-            <w:vAlign w:val="center"/>
-          </w:tcPr>
-          <w:p>
-            <w:r>
-              <w:rPr>
-                <w:b w:val="0"/>
-                <w:i w:val="0"/>
-                <w:sz w:val="18"/>
-              </w:rPr>
-            </w:r>
-          </w:p>
-        </w:tc>
       </w:tr>
       <w:tr>
         <w:tc>
           <w:tcPr>
-            <w:tcW w:type="dxa" w:w="5760"/>
+            <w:tcW w:type="dxa" w:w="8064"/>
             <w:vAlign w:val="center"/>
           </w:tcPr>
           <w:p>
@@ -653,7 +496,7 @@
         </w:tc>
         <w:tc>
           <w:tcPr>
-            <w:tcW w:type="dxa" w:w="1152"/>
+            <w:tcW w:type="dxa" w:w="1296"/>
             <w:vAlign w:val="center"/>
           </w:tcPr>
           <w:p>
@@ -670,26 +513,11 @@
             </w:r>
           </w:p>
         </w:tc>
-        <w:tc>
-          <w:tcPr>
-            <w:tcW w:type="dxa" w:w="3456"/>
-            <w:vAlign w:val="center"/>
-          </w:tcPr>
-          <w:p>
-            <w:r>
-              <w:rPr>
-                <w:b w:val="0"/>
-                <w:i w:val="0"/>
-                <w:sz w:val="18"/>
-              </w:rPr>
-            </w:r>
-          </w:p>
-        </w:tc>
       </w:tr>
       <w:tr>
         <w:tc>
           <w:tcPr>
-            <w:tcW w:type="dxa" w:w="5760"/>
+            <w:tcW w:type="dxa" w:w="8064"/>
             <w:vAlign w:val="center"/>
           </w:tcPr>
           <w:p>
@@ -705,7 +533,7 @@
         </w:tc>
         <w:tc>
           <w:tcPr>
-            <w:tcW w:type="dxa" w:w="1152"/>
+            <w:tcW w:type="dxa" w:w="1296"/>
             <w:vAlign w:val="center"/>
           </w:tcPr>
           <w:p>
@@ -722,26 +550,11 @@
             </w:r>
           </w:p>
         </w:tc>
-        <w:tc>
-          <w:tcPr>
-            <w:tcW w:type="dxa" w:w="3456"/>
-            <w:vAlign w:val="center"/>
-          </w:tcPr>
-          <w:p>
-            <w:r>
-              <w:rPr>
-                <w:b w:val="0"/>
-                <w:i w:val="0"/>
-                <w:sz w:val="18"/>
-              </w:rPr>
-            </w:r>
-          </w:p>
-        </w:tc>
       </w:tr>
       <w:tr>
         <w:tc>
           <w:tcPr>
-            <w:tcW w:type="dxa" w:w="5760"/>
+            <w:tcW w:type="dxa" w:w="8064"/>
             <w:vAlign w:val="center"/>
           </w:tcPr>
           <w:p>
@@ -757,7 +570,7 @@
         </w:tc>
         <w:tc>
           <w:tcPr>
-            <w:tcW w:type="dxa" w:w="1152"/>
+            <w:tcW w:type="dxa" w:w="1296"/>
             <w:vAlign w:val="center"/>
           </w:tcPr>
           <w:p>
@@ -774,26 +587,11 @@
             </w:r>
           </w:p>
         </w:tc>
-        <w:tc>
-          <w:tcPr>
-            <w:tcW w:type="dxa" w:w="3456"/>
-            <w:vAlign w:val="center"/>
-          </w:tcPr>
-          <w:p>
-            <w:r>
-              <w:rPr>
-                <w:b w:val="0"/>
-                <w:i w:val="0"/>
-                <w:sz w:val="18"/>
-              </w:rPr>
-            </w:r>
-          </w:p>
-        </w:tc>
       </w:tr>
       <w:tr>
         <w:tc>
           <w:tcPr>
-            <w:tcW w:type="dxa" w:w="5760"/>
+            <w:tcW w:type="dxa" w:w="8064"/>
             <w:vAlign w:val="center"/>
           </w:tcPr>
           <w:p>
@@ -809,7 +607,7 @@
         </w:tc>
         <w:tc>
           <w:tcPr>
-            <w:tcW w:type="dxa" w:w="1152"/>
+            <w:tcW w:type="dxa" w:w="1296"/>
             <w:vAlign w:val="center"/>
           </w:tcPr>
           <w:p>
@@ -826,26 +624,11 @@
             </w:r>
           </w:p>
         </w:tc>
-        <w:tc>
-          <w:tcPr>
-            <w:tcW w:type="dxa" w:w="3456"/>
-            <w:vAlign w:val="center"/>
-          </w:tcPr>
-          <w:p>
-            <w:r>
-              <w:rPr>
-                <w:b w:val="0"/>
-                <w:i w:val="0"/>
-                <w:sz w:val="18"/>
-              </w:rPr>
-            </w:r>
-          </w:p>
-        </w:tc>
       </w:tr>
       <w:tr>
         <w:tc>
           <w:tcPr>
-            <w:tcW w:type="dxa" w:w="5760"/>
+            <w:tcW w:type="dxa" w:w="8064"/>
             <w:vAlign w:val="center"/>
           </w:tcPr>
           <w:p>
@@ -861,7 +644,7 @@
         </w:tc>
         <w:tc>
           <w:tcPr>
-            <w:tcW w:type="dxa" w:w="1152"/>
+            <w:tcW w:type="dxa" w:w="1296"/>
             <w:vAlign w:val="center"/>
           </w:tcPr>
           <w:p>
@@ -878,26 +661,11 @@
             </w:r>
           </w:p>
         </w:tc>
-        <w:tc>
-          <w:tcPr>
-            <w:tcW w:type="dxa" w:w="3456"/>
-            <w:vAlign w:val="center"/>
-          </w:tcPr>
-          <w:p>
-            <w:r>
-              <w:rPr>
-                <w:b w:val="0"/>
-                <w:i w:val="0"/>
-                <w:sz w:val="18"/>
-              </w:rPr>
-            </w:r>
-          </w:p>
-        </w:tc>
       </w:tr>
       <w:tr>
         <w:tc>
           <w:tcPr>
-            <w:tcW w:type="dxa" w:w="5760"/>
+            <w:tcW w:type="dxa" w:w="8064"/>
             <w:vAlign w:val="center"/>
           </w:tcPr>
           <w:p>
@@ -913,7 +681,7 @@
         </w:tc>
         <w:tc>
           <w:tcPr>
-            <w:tcW w:type="dxa" w:w="1152"/>
+            <w:tcW w:type="dxa" w:w="1296"/>
             <w:vAlign w:val="center"/>
           </w:tcPr>
           <w:p>
@@ -930,27 +698,12 @@
             </w:r>
           </w:p>
         </w:tc>
-        <w:tc>
-          <w:tcPr>
-            <w:tcW w:type="dxa" w:w="3456"/>
-            <w:vAlign w:val="center"/>
-          </w:tcPr>
-          <w:p>
-            <w:r>
-              <w:rPr>
-                <w:b w:val="0"/>
-                <w:i w:val="0"/>
-                <w:sz w:val="18"/>
-              </w:rPr>
-            </w:r>
-          </w:p>
-        </w:tc>
       </w:tr>
       <w:tr>
         <w:tc>
           <w:tcPr>
-            <w:tcW w:type="dxa" w:w="10368"/>
-            <w:gridSpan w:val="3"/>
+            <w:tcW w:type="dxa" w:w="9360"/>
+            <w:gridSpan w:val="2"/>
             <w:vAlign w:val="center"/>
             <w:shd w:val="clear" w:fill="DCE6F1"/>
           </w:tcPr>
@@ -970,7 +723,7 @@
       <w:tr>
         <w:tc>
           <w:tcPr>
-            <w:tcW w:type="dxa" w:w="5760"/>
+            <w:tcW w:type="dxa" w:w="8064"/>
             <w:vAlign w:val="center"/>
           </w:tcPr>
           <w:p>
@@ -986,7 +739,7 @@
         </w:tc>
         <w:tc>
           <w:tcPr>
-            <w:tcW w:type="dxa" w:w="1152"/>
+            <w:tcW w:type="dxa" w:w="1296"/>
             <w:vAlign w:val="center"/>
           </w:tcPr>
           <w:p>
@@ -1003,26 +756,11 @@
             </w:r>
           </w:p>
         </w:tc>
-        <w:tc>
-          <w:tcPr>
-            <w:tcW w:type="dxa" w:w="3456"/>
-            <w:vAlign w:val="center"/>
-          </w:tcPr>
-          <w:p>
-            <w:r>
-              <w:rPr>
-                <w:b w:val="0"/>
-                <w:i w:val="0"/>
-                <w:sz w:val="18"/>
-              </w:rPr>
-            </w:r>
-          </w:p>
-        </w:tc>
       </w:tr>
       <w:tr>
         <w:tc>
           <w:tcPr>
-            <w:tcW w:type="dxa" w:w="5760"/>
+            <w:tcW w:type="dxa" w:w="8064"/>
             <w:vAlign w:val="center"/>
           </w:tcPr>
           <w:p>
@@ -1038,7 +776,7 @@
         </w:tc>
         <w:tc>
           <w:tcPr>
-            <w:tcW w:type="dxa" w:w="1152"/>
+            <w:tcW w:type="dxa" w:w="1296"/>
             <w:vAlign w:val="center"/>
           </w:tcPr>
           <w:p>
@@ -1055,26 +793,11 @@
             </w:r>
           </w:p>
         </w:tc>
-        <w:tc>
-          <w:tcPr>
-            <w:tcW w:type="dxa" w:w="3456"/>
-            <w:vAlign w:val="center"/>
-          </w:tcPr>
-          <w:p>
-            <w:r>
-              <w:rPr>
-                <w:b w:val="0"/>
-                <w:i w:val="0"/>
-                <w:sz w:val="18"/>
-              </w:rPr>
-            </w:r>
-          </w:p>
-        </w:tc>
       </w:tr>
       <w:tr>
         <w:tc>
           <w:tcPr>
-            <w:tcW w:type="dxa" w:w="5760"/>
+            <w:tcW w:type="dxa" w:w="8064"/>
             <w:vAlign w:val="center"/>
           </w:tcPr>
           <w:p>
@@ -1090,7 +813,7 @@
         </w:tc>
         <w:tc>
           <w:tcPr>
-            <w:tcW w:type="dxa" w:w="1152"/>
+            <w:tcW w:type="dxa" w:w="1296"/>
             <w:vAlign w:val="center"/>
           </w:tcPr>
           <w:p>
@@ -1107,26 +830,11 @@
             </w:r>
           </w:p>
         </w:tc>
-        <w:tc>
-          <w:tcPr>
-            <w:tcW w:type="dxa" w:w="3456"/>
-            <w:vAlign w:val="center"/>
-          </w:tcPr>
-          <w:p>
-            <w:r>
-              <w:rPr>
-                <w:b w:val="0"/>
-                <w:i w:val="0"/>
-                <w:sz w:val="18"/>
-              </w:rPr>
-            </w:r>
-          </w:p>
-        </w:tc>
       </w:tr>
       <w:tr>
         <w:tc>
           <w:tcPr>
-            <w:tcW w:type="dxa" w:w="5760"/>
+            <w:tcW w:type="dxa" w:w="8064"/>
             <w:vAlign w:val="center"/>
           </w:tcPr>
           <w:p>
@@ -1142,7 +850,7 @@
         </w:tc>
         <w:tc>
           <w:tcPr>
-            <w:tcW w:type="dxa" w:w="1152"/>
+            <w:tcW w:type="dxa" w:w="1296"/>
             <w:vAlign w:val="center"/>
           </w:tcPr>
           <w:p>
@@ -1159,26 +867,11 @@
             </w:r>
           </w:p>
         </w:tc>
-        <w:tc>
-          <w:tcPr>
-            <w:tcW w:type="dxa" w:w="3456"/>
-            <w:vAlign w:val="center"/>
-          </w:tcPr>
-          <w:p>
-            <w:r>
-              <w:rPr>
-                <w:b w:val="0"/>
-                <w:i w:val="0"/>
-                <w:sz w:val="18"/>
-              </w:rPr>
-            </w:r>
-          </w:p>
-        </w:tc>
       </w:tr>
       <w:tr>
         <w:tc>
           <w:tcPr>
-            <w:tcW w:type="dxa" w:w="5760"/>
+            <w:tcW w:type="dxa" w:w="8064"/>
             <w:vAlign w:val="center"/>
           </w:tcPr>
           <w:p>
@@ -1194,7 +887,7 @@
         </w:tc>
         <w:tc>
           <w:tcPr>
-            <w:tcW w:type="dxa" w:w="1152"/>
+            <w:tcW w:type="dxa" w:w="1296"/>
             <w:vAlign w:val="center"/>
           </w:tcPr>
           <w:p>
@@ -1211,26 +904,11 @@
             </w:r>
           </w:p>
         </w:tc>
-        <w:tc>
-          <w:tcPr>
-            <w:tcW w:type="dxa" w:w="3456"/>
-            <w:vAlign w:val="center"/>
-          </w:tcPr>
-          <w:p>
-            <w:r>
-              <w:rPr>
-                <w:b w:val="0"/>
-                <w:i w:val="0"/>
-                <w:sz w:val="18"/>
-              </w:rPr>
-            </w:r>
-          </w:p>
-        </w:tc>
       </w:tr>
       <w:tr>
         <w:tc>
           <w:tcPr>
-            <w:tcW w:type="dxa" w:w="5760"/>
+            <w:tcW w:type="dxa" w:w="8064"/>
             <w:vAlign w:val="center"/>
           </w:tcPr>
           <w:p>
@@ -1246,7 +924,7 @@
         </w:tc>
         <w:tc>
           <w:tcPr>
-            <w:tcW w:type="dxa" w:w="1152"/>
+            <w:tcW w:type="dxa" w:w="1296"/>
             <w:vAlign w:val="center"/>
           </w:tcPr>
           <w:p>
@@ -1263,27 +941,12 @@
             </w:r>
           </w:p>
         </w:tc>
-        <w:tc>
-          <w:tcPr>
-            <w:tcW w:type="dxa" w:w="3456"/>
-            <w:vAlign w:val="center"/>
-          </w:tcPr>
-          <w:p>
-            <w:r>
-              <w:rPr>
-                <w:b w:val="0"/>
-                <w:i w:val="0"/>
-                <w:sz w:val="18"/>
-              </w:rPr>
-            </w:r>
-          </w:p>
-        </w:tc>
       </w:tr>
       <w:tr>
         <w:tc>
           <w:tcPr>
-            <w:tcW w:type="dxa" w:w="10368"/>
-            <w:gridSpan w:val="3"/>
+            <w:tcW w:type="dxa" w:w="9360"/>
+            <w:gridSpan w:val="2"/>
             <w:vAlign w:val="center"/>
             <w:shd w:val="clear" w:fill="DCE6F1"/>
           </w:tcPr>
@@ -1303,7 +966,7 @@
       <w:tr>
         <w:tc>
           <w:tcPr>
-            <w:tcW w:type="dxa" w:w="5760"/>
+            <w:tcW w:type="dxa" w:w="8064"/>
             <w:vAlign w:val="center"/>
           </w:tcPr>
           <w:p>
@@ -1319,7 +982,7 @@
         </w:tc>
         <w:tc>
           <w:tcPr>
-            <w:tcW w:type="dxa" w:w="1152"/>
+            <w:tcW w:type="dxa" w:w="1296"/>
             <w:vAlign w:val="center"/>
           </w:tcPr>
           <w:p>
@@ -1336,26 +999,11 @@
             </w:r>
           </w:p>
         </w:tc>
-        <w:tc>
-          <w:tcPr>
-            <w:tcW w:type="dxa" w:w="3456"/>
-            <w:vAlign w:val="center"/>
-          </w:tcPr>
-          <w:p>
-            <w:r>
-              <w:rPr>
-                <w:b w:val="0"/>
-                <w:i w:val="0"/>
-                <w:sz w:val="18"/>
-              </w:rPr>
-            </w:r>
-          </w:p>
-        </w:tc>
       </w:tr>
       <w:tr>
         <w:tc>
           <w:tcPr>
-            <w:tcW w:type="dxa" w:w="5760"/>
+            <w:tcW w:type="dxa" w:w="8064"/>
             <w:vAlign w:val="center"/>
           </w:tcPr>
           <w:p>
@@ -1371,7 +1019,7 @@
         </w:tc>
         <w:tc>
           <w:tcPr>
-            <w:tcW w:type="dxa" w:w="1152"/>
+            <w:tcW w:type="dxa" w:w="1296"/>
             <w:vAlign w:val="center"/>
           </w:tcPr>
           <w:p>
@@ -1388,26 +1036,11 @@
             </w:r>
           </w:p>
         </w:tc>
-        <w:tc>
-          <w:tcPr>
-            <w:tcW w:type="dxa" w:w="3456"/>
-            <w:vAlign w:val="center"/>
-          </w:tcPr>
-          <w:p>
-            <w:r>
-              <w:rPr>
-                <w:b w:val="0"/>
-                <w:i w:val="0"/>
-                <w:sz w:val="18"/>
-              </w:rPr>
-            </w:r>
-          </w:p>
-        </w:tc>
       </w:tr>
       <w:tr>
         <w:tc>
           <w:tcPr>
-            <w:tcW w:type="dxa" w:w="5760"/>
+            <w:tcW w:type="dxa" w:w="8064"/>
             <w:vAlign w:val="center"/>
           </w:tcPr>
           <w:p>
@@ -1423,7 +1056,7 @@
         </w:tc>
         <w:tc>
           <w:tcPr>
-            <w:tcW w:type="dxa" w:w="1152"/>
+            <w:tcW w:type="dxa" w:w="1296"/>
             <w:vAlign w:val="center"/>
           </w:tcPr>
           <w:p>
@@ -1440,26 +1073,11 @@
             </w:r>
           </w:p>
         </w:tc>
-        <w:tc>
-          <w:tcPr>
-            <w:tcW w:type="dxa" w:w="3456"/>
-            <w:vAlign w:val="center"/>
-          </w:tcPr>
-          <w:p>
-            <w:r>
-              <w:rPr>
-                <w:b w:val="0"/>
-                <w:i w:val="0"/>
-                <w:sz w:val="18"/>
-              </w:rPr>
-            </w:r>
-          </w:p>
-        </w:tc>
       </w:tr>
       <w:tr>
         <w:tc>
           <w:tcPr>
-            <w:tcW w:type="dxa" w:w="5760"/>
+            <w:tcW w:type="dxa" w:w="8064"/>
             <w:vAlign w:val="center"/>
           </w:tcPr>
           <w:p>
@@ -1475,7 +1093,7 @@
         </w:tc>
         <w:tc>
           <w:tcPr>
-            <w:tcW w:type="dxa" w:w="1152"/>
+            <w:tcW w:type="dxa" w:w="1296"/>
             <w:vAlign w:val="center"/>
           </w:tcPr>
           <w:p>
@@ -1492,26 +1110,11 @@
             </w:r>
           </w:p>
         </w:tc>
-        <w:tc>
-          <w:tcPr>
-            <w:tcW w:type="dxa" w:w="3456"/>
-            <w:vAlign w:val="center"/>
-          </w:tcPr>
-          <w:p>
-            <w:r>
-              <w:rPr>
-                <w:b w:val="0"/>
-                <w:i w:val="0"/>
-                <w:sz w:val="18"/>
-              </w:rPr>
-            </w:r>
-          </w:p>
-        </w:tc>
       </w:tr>
       <w:tr>
         <w:tc>
           <w:tcPr>
-            <w:tcW w:type="dxa" w:w="5760"/>
+            <w:tcW w:type="dxa" w:w="8064"/>
             <w:vAlign w:val="center"/>
           </w:tcPr>
           <w:p>
@@ -1527,7 +1130,7 @@
         </w:tc>
         <w:tc>
           <w:tcPr>
-            <w:tcW w:type="dxa" w:w="1152"/>
+            <w:tcW w:type="dxa" w:w="1296"/>
             <w:vAlign w:val="center"/>
           </w:tcPr>
           <w:p>
@@ -1544,26 +1147,11 @@
             </w:r>
           </w:p>
         </w:tc>
-        <w:tc>
-          <w:tcPr>
-            <w:tcW w:type="dxa" w:w="3456"/>
-            <w:vAlign w:val="center"/>
-          </w:tcPr>
-          <w:p>
-            <w:r>
-              <w:rPr>
-                <w:b w:val="0"/>
-                <w:i w:val="0"/>
-                <w:sz w:val="18"/>
-              </w:rPr>
-            </w:r>
-          </w:p>
-        </w:tc>
       </w:tr>
       <w:tr>
         <w:tc>
           <w:tcPr>
-            <w:tcW w:type="dxa" w:w="5760"/>
+            <w:tcW w:type="dxa" w:w="8064"/>
             <w:vAlign w:val="center"/>
           </w:tcPr>
           <w:p>
@@ -1579,7 +1167,7 @@
         </w:tc>
         <w:tc>
           <w:tcPr>
-            <w:tcW w:type="dxa" w:w="1152"/>
+            <w:tcW w:type="dxa" w:w="1296"/>
             <w:vAlign w:val="center"/>
           </w:tcPr>
           <w:p>
@@ -1596,26 +1184,11 @@
             </w:r>
           </w:p>
         </w:tc>
-        <w:tc>
-          <w:tcPr>
-            <w:tcW w:type="dxa" w:w="3456"/>
-            <w:vAlign w:val="center"/>
-          </w:tcPr>
-          <w:p>
-            <w:r>
-              <w:rPr>
-                <w:b w:val="0"/>
-                <w:i w:val="0"/>
-                <w:sz w:val="18"/>
-              </w:rPr>
-            </w:r>
-          </w:p>
-        </w:tc>
       </w:tr>
       <w:tr>
         <w:tc>
           <w:tcPr>
-            <w:tcW w:type="dxa" w:w="5760"/>
+            <w:tcW w:type="dxa" w:w="8064"/>
             <w:vAlign w:val="center"/>
           </w:tcPr>
           <w:p>
@@ -1631,7 +1204,7 @@
         </w:tc>
         <w:tc>
           <w:tcPr>
-            <w:tcW w:type="dxa" w:w="1152"/>
+            <w:tcW w:type="dxa" w:w="1296"/>
             <w:vAlign w:val="center"/>
           </w:tcPr>
           <w:p>
@@ -1648,26 +1221,11 @@
             </w:r>
           </w:p>
         </w:tc>
-        <w:tc>
-          <w:tcPr>
-            <w:tcW w:type="dxa" w:w="3456"/>
-            <w:vAlign w:val="center"/>
-          </w:tcPr>
-          <w:p>
-            <w:r>
-              <w:rPr>
-                <w:b w:val="0"/>
-                <w:i w:val="0"/>
-                <w:sz w:val="18"/>
-              </w:rPr>
-            </w:r>
-          </w:p>
-        </w:tc>
       </w:tr>
       <w:tr>
         <w:tc>
           <w:tcPr>
-            <w:tcW w:type="dxa" w:w="5760"/>
+            <w:tcW w:type="dxa" w:w="8064"/>
             <w:vAlign w:val="center"/>
           </w:tcPr>
           <w:p>
@@ -1683,7 +1241,7 @@
         </w:tc>
         <w:tc>
           <w:tcPr>
-            <w:tcW w:type="dxa" w:w="1152"/>
+            <w:tcW w:type="dxa" w:w="1296"/>
             <w:vAlign w:val="center"/>
           </w:tcPr>
           <w:p>
@@ -1700,27 +1258,12 @@
             </w:r>
           </w:p>
         </w:tc>
-        <w:tc>
-          <w:tcPr>
-            <w:tcW w:type="dxa" w:w="3456"/>
-            <w:vAlign w:val="center"/>
-          </w:tcPr>
-          <w:p>
-            <w:r>
-              <w:rPr>
-                <w:b w:val="0"/>
-                <w:i w:val="0"/>
-                <w:sz w:val="18"/>
-              </w:rPr>
-            </w:r>
-          </w:p>
-        </w:tc>
       </w:tr>
       <w:tr>
         <w:tc>
           <w:tcPr>
-            <w:tcW w:type="dxa" w:w="10368"/>
-            <w:gridSpan w:val="3"/>
+            <w:tcW w:type="dxa" w:w="9360"/>
+            <w:gridSpan w:val="2"/>
             <w:vAlign w:val="center"/>
             <w:shd w:val="clear" w:fill="DCE6F1"/>
           </w:tcPr>
@@ -1740,7 +1283,7 @@
       <w:tr>
         <w:tc>
           <w:tcPr>
-            <w:tcW w:type="dxa" w:w="5760"/>
+            <w:tcW w:type="dxa" w:w="8064"/>
             <w:vAlign w:val="center"/>
           </w:tcPr>
           <w:p>
@@ -1756,7 +1299,7 @@
         </w:tc>
         <w:tc>
           <w:tcPr>
-            <w:tcW w:type="dxa" w:w="1152"/>
+            <w:tcW w:type="dxa" w:w="1296"/>
             <w:vAlign w:val="center"/>
           </w:tcPr>
           <w:p>
@@ -1773,26 +1316,11 @@
             </w:r>
           </w:p>
         </w:tc>
-        <w:tc>
-          <w:tcPr>
-            <w:tcW w:type="dxa" w:w="3456"/>
-            <w:vAlign w:val="center"/>
-          </w:tcPr>
-          <w:p>
-            <w:r>
-              <w:rPr>
-                <w:b w:val="0"/>
-                <w:i w:val="0"/>
-                <w:sz w:val="18"/>
-              </w:rPr>
-            </w:r>
-          </w:p>
-        </w:tc>
       </w:tr>
       <w:tr>
         <w:tc>
           <w:tcPr>
-            <w:tcW w:type="dxa" w:w="5760"/>
+            <w:tcW w:type="dxa" w:w="8064"/>
             <w:vAlign w:val="center"/>
           </w:tcPr>
           <w:p>
@@ -1808,7 +1336,7 @@
         </w:tc>
         <w:tc>
           <w:tcPr>
-            <w:tcW w:type="dxa" w:w="1152"/>
+            <w:tcW w:type="dxa" w:w="1296"/>
             <w:vAlign w:val="center"/>
           </w:tcPr>
           <w:p>
@@ -1825,27 +1353,12 @@
             </w:r>
           </w:p>
         </w:tc>
-        <w:tc>
-          <w:tcPr>
-            <w:tcW w:type="dxa" w:w="3456"/>
-            <w:vAlign w:val="center"/>
-          </w:tcPr>
-          <w:p>
-            <w:r>
-              <w:rPr>
-                <w:b w:val="0"/>
-                <w:i w:val="0"/>
-                <w:sz w:val="18"/>
-              </w:rPr>
-            </w:r>
-          </w:p>
-        </w:tc>
       </w:tr>
       <w:tr>
         <w:tc>
           <w:tcPr>
-            <w:tcW w:type="dxa" w:w="10368"/>
-            <w:gridSpan w:val="3"/>
+            <w:tcW w:type="dxa" w:w="9360"/>
+            <w:gridSpan w:val="2"/>
             <w:vAlign w:val="center"/>
             <w:shd w:val="clear" w:fill="DCE6F1"/>
           </w:tcPr>
@@ -1865,7 +1378,7 @@
       <w:tr>
         <w:tc>
           <w:tcPr>
-            <w:tcW w:type="dxa" w:w="5760"/>
+            <w:tcW w:type="dxa" w:w="8064"/>
             <w:vAlign w:val="center"/>
           </w:tcPr>
           <w:p>
@@ -1881,7 +1394,7 @@
         </w:tc>
         <w:tc>
           <w:tcPr>
-            <w:tcW w:type="dxa" w:w="1152"/>
+            <w:tcW w:type="dxa" w:w="1296"/>
             <w:vAlign w:val="center"/>
           </w:tcPr>
           <w:p>
@@ -1898,26 +1411,11 @@
             </w:r>
           </w:p>
         </w:tc>
-        <w:tc>
-          <w:tcPr>
-            <w:tcW w:type="dxa" w:w="3456"/>
-            <w:vAlign w:val="center"/>
-          </w:tcPr>
-          <w:p>
-            <w:r>
-              <w:rPr>
-                <w:b w:val="0"/>
-                <w:i w:val="0"/>
-                <w:sz w:val="18"/>
-              </w:rPr>
-            </w:r>
-          </w:p>
-        </w:tc>
       </w:tr>
       <w:tr>
         <w:tc>
           <w:tcPr>
-            <w:tcW w:type="dxa" w:w="5760"/>
+            <w:tcW w:type="dxa" w:w="8064"/>
             <w:vAlign w:val="center"/>
           </w:tcPr>
           <w:p>
@@ -1933,7 +1431,7 @@
         </w:tc>
         <w:tc>
           <w:tcPr>
-            <w:tcW w:type="dxa" w:w="1152"/>
+            <w:tcW w:type="dxa" w:w="1296"/>
             <w:vAlign w:val="center"/>
           </w:tcPr>
           <w:p>
@@ -1950,26 +1448,11 @@
             </w:r>
           </w:p>
         </w:tc>
-        <w:tc>
-          <w:tcPr>
-            <w:tcW w:type="dxa" w:w="3456"/>
-            <w:vAlign w:val="center"/>
-          </w:tcPr>
-          <w:p>
-            <w:r>
-              <w:rPr>
-                <w:b w:val="0"/>
-                <w:i w:val="0"/>
-                <w:sz w:val="18"/>
-              </w:rPr>
-            </w:r>
-          </w:p>
-        </w:tc>
       </w:tr>
       <w:tr>
         <w:tc>
           <w:tcPr>
-            <w:tcW w:type="dxa" w:w="5760"/>
+            <w:tcW w:type="dxa" w:w="8064"/>
             <w:vAlign w:val="center"/>
           </w:tcPr>
           <w:p>
@@ -1985,7 +1468,7 @@
         </w:tc>
         <w:tc>
           <w:tcPr>
-            <w:tcW w:type="dxa" w:w="1152"/>
+            <w:tcW w:type="dxa" w:w="1296"/>
             <w:vAlign w:val="center"/>
           </w:tcPr>
           <w:p>
@@ -2002,26 +1485,11 @@
             </w:r>
           </w:p>
         </w:tc>
-        <w:tc>
-          <w:tcPr>
-            <w:tcW w:type="dxa" w:w="3456"/>
-            <w:vAlign w:val="center"/>
-          </w:tcPr>
-          <w:p>
-            <w:r>
-              <w:rPr>
-                <w:b w:val="0"/>
-                <w:i w:val="0"/>
-                <w:sz w:val="18"/>
-              </w:rPr>
-            </w:r>
-          </w:p>
-        </w:tc>
       </w:tr>
       <w:tr>
         <w:tc>
           <w:tcPr>
-            <w:tcW w:type="dxa" w:w="5760"/>
+            <w:tcW w:type="dxa" w:w="8064"/>
             <w:vAlign w:val="center"/>
           </w:tcPr>
           <w:p>
@@ -2037,7 +1505,7 @@
         </w:tc>
         <w:tc>
           <w:tcPr>
-            <w:tcW w:type="dxa" w:w="1152"/>
+            <w:tcW w:type="dxa" w:w="1296"/>
             <w:vAlign w:val="center"/>
           </w:tcPr>
           <w:p>
@@ -2054,26 +1522,11 @@
             </w:r>
           </w:p>
         </w:tc>
-        <w:tc>
-          <w:tcPr>
-            <w:tcW w:type="dxa" w:w="3456"/>
-            <w:vAlign w:val="center"/>
-          </w:tcPr>
-          <w:p>
-            <w:r>
-              <w:rPr>
-                <w:b w:val="0"/>
-                <w:i w:val="0"/>
-                <w:sz w:val="18"/>
-              </w:rPr>
-            </w:r>
-          </w:p>
-        </w:tc>
       </w:tr>
       <w:tr>
         <w:tc>
           <w:tcPr>
-            <w:tcW w:type="dxa" w:w="5760"/>
+            <w:tcW w:type="dxa" w:w="8064"/>
             <w:vAlign w:val="center"/>
           </w:tcPr>
           <w:p>
@@ -2089,7 +1542,7 @@
         </w:tc>
         <w:tc>
           <w:tcPr>
-            <w:tcW w:type="dxa" w:w="1152"/>
+            <w:tcW w:type="dxa" w:w="1296"/>
             <w:vAlign w:val="center"/>
           </w:tcPr>
           <w:p>
@@ -2106,26 +1559,11 @@
             </w:r>
           </w:p>
         </w:tc>
-        <w:tc>
-          <w:tcPr>
-            <w:tcW w:type="dxa" w:w="3456"/>
-            <w:vAlign w:val="center"/>
-          </w:tcPr>
-          <w:p>
-            <w:r>
-              <w:rPr>
-                <w:b w:val="0"/>
-                <w:i w:val="0"/>
-                <w:sz w:val="18"/>
-              </w:rPr>
-            </w:r>
-          </w:p>
-        </w:tc>
       </w:tr>
       <w:tr>
         <w:tc>
           <w:tcPr>
-            <w:tcW w:type="dxa" w:w="5760"/>
+            <w:tcW w:type="dxa" w:w="8064"/>
             <w:vAlign w:val="center"/>
           </w:tcPr>
           <w:p>
@@ -2141,7 +1579,7 @@
         </w:tc>
         <w:tc>
           <w:tcPr>
-            <w:tcW w:type="dxa" w:w="1152"/>
+            <w:tcW w:type="dxa" w:w="1296"/>
             <w:vAlign w:val="center"/>
           </w:tcPr>
           <w:p>
@@ -2158,26 +1596,11 @@
             </w:r>
           </w:p>
         </w:tc>
-        <w:tc>
-          <w:tcPr>
-            <w:tcW w:type="dxa" w:w="3456"/>
-            <w:vAlign w:val="center"/>
-          </w:tcPr>
-          <w:p>
-            <w:r>
-              <w:rPr>
-                <w:b w:val="0"/>
-                <w:i w:val="0"/>
-                <w:sz w:val="18"/>
-              </w:rPr>
-            </w:r>
-          </w:p>
-        </w:tc>
       </w:tr>
       <w:tr>
         <w:tc>
           <w:tcPr>
-            <w:tcW w:type="dxa" w:w="5760"/>
+            <w:tcW w:type="dxa" w:w="8064"/>
             <w:vAlign w:val="center"/>
           </w:tcPr>
           <w:p>
@@ -2193,7 +1616,7 @@
         </w:tc>
         <w:tc>
           <w:tcPr>
-            <w:tcW w:type="dxa" w:w="1152"/>
+            <w:tcW w:type="dxa" w:w="1296"/>
             <w:vAlign w:val="center"/>
           </w:tcPr>
           <w:p>
@@ -2210,26 +1633,11 @@
             </w:r>
           </w:p>
         </w:tc>
-        <w:tc>
-          <w:tcPr>
-            <w:tcW w:type="dxa" w:w="3456"/>
-            <w:vAlign w:val="center"/>
-          </w:tcPr>
-          <w:p>
-            <w:r>
-              <w:rPr>
-                <w:b w:val="0"/>
-                <w:i w:val="0"/>
-                <w:sz w:val="18"/>
-              </w:rPr>
-            </w:r>
-          </w:p>
-        </w:tc>
       </w:tr>
       <w:tr>
         <w:tc>
           <w:tcPr>
-            <w:tcW w:type="dxa" w:w="5760"/>
+            <w:tcW w:type="dxa" w:w="8064"/>
             <w:vAlign w:val="center"/>
           </w:tcPr>
           <w:p>
@@ -2245,7 +1653,7 @@
         </w:tc>
         <w:tc>
           <w:tcPr>
-            <w:tcW w:type="dxa" w:w="1152"/>
+            <w:tcW w:type="dxa" w:w="1296"/>
             <w:vAlign w:val="center"/>
           </w:tcPr>
           <w:p>
@@ -2262,27 +1670,12 @@
             </w:r>
           </w:p>
         </w:tc>
-        <w:tc>
-          <w:tcPr>
-            <w:tcW w:type="dxa" w:w="3456"/>
-            <w:vAlign w:val="center"/>
-          </w:tcPr>
-          <w:p>
-            <w:r>
-              <w:rPr>
-                <w:b w:val="0"/>
-                <w:i w:val="0"/>
-                <w:sz w:val="18"/>
-              </w:rPr>
-            </w:r>
-          </w:p>
-        </w:tc>
       </w:tr>
       <w:tr>
         <w:tc>
           <w:tcPr>
-            <w:tcW w:type="dxa" w:w="10368"/>
-            <w:gridSpan w:val="3"/>
+            <w:tcW w:type="dxa" w:w="9360"/>
+            <w:gridSpan w:val="2"/>
             <w:vAlign w:val="center"/>
             <w:shd w:val="clear" w:fill="DCE6F1"/>
           </w:tcPr>
@@ -2302,7 +1695,7 @@
       <w:tr>
         <w:tc>
           <w:tcPr>
-            <w:tcW w:type="dxa" w:w="5760"/>
+            <w:tcW w:type="dxa" w:w="8064"/>
             <w:vAlign w:val="center"/>
           </w:tcPr>
           <w:p>
@@ -2318,7 +1711,7 @@
         </w:tc>
         <w:tc>
           <w:tcPr>
-            <w:tcW w:type="dxa" w:w="1152"/>
+            <w:tcW w:type="dxa" w:w="1296"/>
             <w:vAlign w:val="center"/>
           </w:tcPr>
           <w:p>
@@ -2335,26 +1728,11 @@
             </w:r>
           </w:p>
         </w:tc>
-        <w:tc>
-          <w:tcPr>
-            <w:tcW w:type="dxa" w:w="3456"/>
-            <w:vAlign w:val="center"/>
-          </w:tcPr>
-          <w:p>
-            <w:r>
-              <w:rPr>
-                <w:b w:val="0"/>
-                <w:i w:val="0"/>
-                <w:sz w:val="18"/>
-              </w:rPr>
-            </w:r>
-          </w:p>
-        </w:tc>
       </w:tr>
       <w:tr>
         <w:tc>
           <w:tcPr>
-            <w:tcW w:type="dxa" w:w="5760"/>
+            <w:tcW w:type="dxa" w:w="8064"/>
             <w:vAlign w:val="center"/>
           </w:tcPr>
           <w:p>
@@ -2370,7 +1748,7 @@
         </w:tc>
         <w:tc>
           <w:tcPr>
-            <w:tcW w:type="dxa" w:w="1152"/>
+            <w:tcW w:type="dxa" w:w="1296"/>
             <w:vAlign w:val="center"/>
           </w:tcPr>
           <w:p>
@@ -2387,26 +1765,11 @@
             </w:r>
           </w:p>
         </w:tc>
-        <w:tc>
-          <w:tcPr>
-            <w:tcW w:type="dxa" w:w="3456"/>
-            <w:vAlign w:val="center"/>
-          </w:tcPr>
-          <w:p>
-            <w:r>
-              <w:rPr>
-                <w:b w:val="0"/>
-                <w:i w:val="0"/>
-                <w:sz w:val="18"/>
-              </w:rPr>
-            </w:r>
-          </w:p>
-        </w:tc>
       </w:tr>
       <w:tr>
         <w:tc>
           <w:tcPr>
-            <w:tcW w:type="dxa" w:w="5760"/>
+            <w:tcW w:type="dxa" w:w="8064"/>
             <w:vAlign w:val="center"/>
           </w:tcPr>
           <w:p>
@@ -2422,7 +1785,7 @@
         </w:tc>
         <w:tc>
           <w:tcPr>
-            <w:tcW w:type="dxa" w:w="1152"/>
+            <w:tcW w:type="dxa" w:w="1296"/>
             <w:vAlign w:val="center"/>
           </w:tcPr>
           <w:p>
@@ -2439,26 +1802,11 @@
             </w:r>
           </w:p>
         </w:tc>
-        <w:tc>
-          <w:tcPr>
-            <w:tcW w:type="dxa" w:w="3456"/>
-            <w:vAlign w:val="center"/>
-          </w:tcPr>
-          <w:p>
-            <w:r>
-              <w:rPr>
-                <w:b w:val="0"/>
-                <w:i w:val="0"/>
-                <w:sz w:val="18"/>
-              </w:rPr>
-            </w:r>
-          </w:p>
-        </w:tc>
       </w:tr>
       <w:tr>
         <w:tc>
           <w:tcPr>
-            <w:tcW w:type="dxa" w:w="5760"/>
+            <w:tcW w:type="dxa" w:w="8064"/>
             <w:vAlign w:val="center"/>
           </w:tcPr>
           <w:p>
@@ -2474,7 +1822,7 @@
         </w:tc>
         <w:tc>
           <w:tcPr>
-            <w:tcW w:type="dxa" w:w="1152"/>
+            <w:tcW w:type="dxa" w:w="1296"/>
             <w:vAlign w:val="center"/>
           </w:tcPr>
           <w:p>
@@ -2491,26 +1839,11 @@
             </w:r>
           </w:p>
         </w:tc>
-        <w:tc>
-          <w:tcPr>
-            <w:tcW w:type="dxa" w:w="3456"/>
-            <w:vAlign w:val="center"/>
-          </w:tcPr>
-          <w:p>
-            <w:r>
-              <w:rPr>
-                <w:b w:val="0"/>
-                <w:i w:val="0"/>
-                <w:sz w:val="18"/>
-              </w:rPr>
-            </w:r>
-          </w:p>
-        </w:tc>
       </w:tr>
       <w:tr>
         <w:tc>
           <w:tcPr>
-            <w:tcW w:type="dxa" w:w="5760"/>
+            <w:tcW w:type="dxa" w:w="8064"/>
             <w:vAlign w:val="center"/>
           </w:tcPr>
           <w:p>
@@ -2526,7 +1859,7 @@
         </w:tc>
         <w:tc>
           <w:tcPr>
-            <w:tcW w:type="dxa" w:w="1152"/>
+            <w:tcW w:type="dxa" w:w="1296"/>
             <w:vAlign w:val="center"/>
           </w:tcPr>
           <w:p>
@@ -2543,26 +1876,11 @@
             </w:r>
           </w:p>
         </w:tc>
-        <w:tc>
-          <w:tcPr>
-            <w:tcW w:type="dxa" w:w="3456"/>
-            <w:vAlign w:val="center"/>
-          </w:tcPr>
-          <w:p>
-            <w:r>
-              <w:rPr>
-                <w:b w:val="0"/>
-                <w:i w:val="0"/>
-                <w:sz w:val="18"/>
-              </w:rPr>
-            </w:r>
-          </w:p>
-        </w:tc>
       </w:tr>
       <w:tr>
         <w:tc>
           <w:tcPr>
-            <w:tcW w:type="dxa" w:w="5760"/>
+            <w:tcW w:type="dxa" w:w="8064"/>
             <w:vAlign w:val="center"/>
           </w:tcPr>
           <w:p>
@@ -2578,7 +1896,7 @@
         </w:tc>
         <w:tc>
           <w:tcPr>
-            <w:tcW w:type="dxa" w:w="1152"/>
+            <w:tcW w:type="dxa" w:w="1296"/>
             <w:vAlign w:val="center"/>
           </w:tcPr>
           <w:p>
@@ -2595,26 +1913,11 @@
             </w:r>
           </w:p>
         </w:tc>
-        <w:tc>
-          <w:tcPr>
-            <w:tcW w:type="dxa" w:w="3456"/>
-            <w:vAlign w:val="center"/>
-          </w:tcPr>
-          <w:p>
-            <w:r>
-              <w:rPr>
-                <w:b w:val="0"/>
-                <w:i w:val="0"/>
-                <w:sz w:val="18"/>
-              </w:rPr>
-            </w:r>
-          </w:p>
-        </w:tc>
       </w:tr>
       <w:tr>
         <w:tc>
           <w:tcPr>
-            <w:tcW w:type="dxa" w:w="5760"/>
+            <w:tcW w:type="dxa" w:w="8064"/>
             <w:vAlign w:val="center"/>
           </w:tcPr>
           <w:p>
@@ -2630,7 +1933,7 @@
         </w:tc>
         <w:tc>
           <w:tcPr>
-            <w:tcW w:type="dxa" w:w="1152"/>
+            <w:tcW w:type="dxa" w:w="1296"/>
             <w:vAlign w:val="center"/>
           </w:tcPr>
           <w:p>
@@ -2647,26 +1950,11 @@
             </w:r>
           </w:p>
         </w:tc>
-        <w:tc>
-          <w:tcPr>
-            <w:tcW w:type="dxa" w:w="3456"/>
-            <w:vAlign w:val="center"/>
-          </w:tcPr>
-          <w:p>
-            <w:r>
-              <w:rPr>
-                <w:b w:val="0"/>
-                <w:i w:val="0"/>
-                <w:sz w:val="18"/>
-              </w:rPr>
-            </w:r>
-          </w:p>
-        </w:tc>
       </w:tr>
       <w:tr>
         <w:tc>
           <w:tcPr>
-            <w:tcW w:type="dxa" w:w="5760"/>
+            <w:tcW w:type="dxa" w:w="8064"/>
             <w:vAlign w:val="center"/>
           </w:tcPr>
           <w:p>
@@ -2682,7 +1970,7 @@
         </w:tc>
         <w:tc>
           <w:tcPr>
-            <w:tcW w:type="dxa" w:w="1152"/>
+            <w:tcW w:type="dxa" w:w="1296"/>
             <w:vAlign w:val="center"/>
           </w:tcPr>
           <w:p>
@@ -2699,26 +1987,11 @@
             </w:r>
           </w:p>
         </w:tc>
-        <w:tc>
-          <w:tcPr>
-            <w:tcW w:type="dxa" w:w="3456"/>
-            <w:vAlign w:val="center"/>
-          </w:tcPr>
-          <w:p>
-            <w:r>
-              <w:rPr>
-                <w:b w:val="0"/>
-                <w:i w:val="0"/>
-                <w:sz w:val="18"/>
-              </w:rPr>
-            </w:r>
-          </w:p>
-        </w:tc>
       </w:tr>
       <w:tr>
         <w:tc>
           <w:tcPr>
-            <w:tcW w:type="dxa" w:w="5760"/>
+            <w:tcW w:type="dxa" w:w="8064"/>
             <w:vAlign w:val="center"/>
           </w:tcPr>
           <w:p>
@@ -2734,7 +2007,7 @@
         </w:tc>
         <w:tc>
           <w:tcPr>
-            <w:tcW w:type="dxa" w:w="1152"/>
+            <w:tcW w:type="dxa" w:w="1296"/>
             <w:vAlign w:val="center"/>
           </w:tcPr>
           <w:p>
@@ -2751,26 +2024,11 @@
             </w:r>
           </w:p>
         </w:tc>
-        <w:tc>
-          <w:tcPr>
-            <w:tcW w:type="dxa" w:w="3456"/>
-            <w:vAlign w:val="center"/>
-          </w:tcPr>
-          <w:p>
-            <w:r>
-              <w:rPr>
-                <w:b w:val="0"/>
-                <w:i w:val="0"/>
-                <w:sz w:val="18"/>
-              </w:rPr>
-            </w:r>
-          </w:p>
-        </w:tc>
       </w:tr>
       <w:tr>
         <w:tc>
           <w:tcPr>
-            <w:tcW w:type="dxa" w:w="5760"/>
+            <w:tcW w:type="dxa" w:w="8064"/>
             <w:vAlign w:val="center"/>
           </w:tcPr>
           <w:p>
@@ -2786,7 +2044,7 @@
         </w:tc>
         <w:tc>
           <w:tcPr>
-            <w:tcW w:type="dxa" w:w="1152"/>
+            <w:tcW w:type="dxa" w:w="1296"/>
             <w:vAlign w:val="center"/>
           </w:tcPr>
           <w:p>
@@ -2803,26 +2061,11 @@
             </w:r>
           </w:p>
         </w:tc>
-        <w:tc>
-          <w:tcPr>
-            <w:tcW w:type="dxa" w:w="3456"/>
-            <w:vAlign w:val="center"/>
-          </w:tcPr>
-          <w:p>
-            <w:r>
-              <w:rPr>
-                <w:b w:val="0"/>
-                <w:i w:val="0"/>
-                <w:sz w:val="18"/>
-              </w:rPr>
-            </w:r>
-          </w:p>
-        </w:tc>
       </w:tr>
       <w:tr>
         <w:tc>
           <w:tcPr>
-            <w:tcW w:type="dxa" w:w="5760"/>
+            <w:tcW w:type="dxa" w:w="8064"/>
             <w:vAlign w:val="center"/>
           </w:tcPr>
           <w:p>
@@ -2838,7 +2081,7 @@
         </w:tc>
         <w:tc>
           <w:tcPr>
-            <w:tcW w:type="dxa" w:w="1152"/>
+            <w:tcW w:type="dxa" w:w="1296"/>
             <w:vAlign w:val="center"/>
           </w:tcPr>
           <w:p>
@@ -2855,26 +2098,11 @@
             </w:r>
           </w:p>
         </w:tc>
-        <w:tc>
-          <w:tcPr>
-            <w:tcW w:type="dxa" w:w="3456"/>
-            <w:vAlign w:val="center"/>
-          </w:tcPr>
-          <w:p>
-            <w:r>
-              <w:rPr>
-                <w:b w:val="0"/>
-                <w:i w:val="0"/>
-                <w:sz w:val="18"/>
-              </w:rPr>
-            </w:r>
-          </w:p>
-        </w:tc>
       </w:tr>
       <w:tr>
         <w:tc>
           <w:tcPr>
-            <w:tcW w:type="dxa" w:w="5760"/>
+            <w:tcW w:type="dxa" w:w="8064"/>
             <w:vAlign w:val="center"/>
           </w:tcPr>
           <w:p>
@@ -2890,7 +2118,7 @@
         </w:tc>
         <w:tc>
           <w:tcPr>
-            <w:tcW w:type="dxa" w:w="1152"/>
+            <w:tcW w:type="dxa" w:w="1296"/>
             <w:vAlign w:val="center"/>
           </w:tcPr>
           <w:p>
@@ -2907,27 +2135,12 @@
             </w:r>
           </w:p>
         </w:tc>
-        <w:tc>
-          <w:tcPr>
-            <w:tcW w:type="dxa" w:w="3456"/>
-            <w:vAlign w:val="center"/>
-          </w:tcPr>
-          <w:p>
-            <w:r>
-              <w:rPr>
-                <w:b w:val="0"/>
-                <w:i w:val="0"/>
-                <w:sz w:val="18"/>
-              </w:rPr>
-            </w:r>
-          </w:p>
-        </w:tc>
       </w:tr>
       <w:tr>
         <w:tc>
           <w:tcPr>
-            <w:tcW w:type="dxa" w:w="10368"/>
-            <w:gridSpan w:val="3"/>
+            <w:tcW w:type="dxa" w:w="9360"/>
+            <w:gridSpan w:val="2"/>
             <w:vAlign w:val="center"/>
             <w:shd w:val="clear" w:fill="DCE6F1"/>
           </w:tcPr>
@@ -2947,7 +2160,7 @@
       <w:tr>
         <w:tc>
           <w:tcPr>
-            <w:tcW w:type="dxa" w:w="5760"/>
+            <w:tcW w:type="dxa" w:w="8064"/>
             <w:vAlign w:val="center"/>
           </w:tcPr>
           <w:p>
@@ -2963,7 +2176,7 @@
         </w:tc>
         <w:tc>
           <w:tcPr>
-            <w:tcW w:type="dxa" w:w="1152"/>
+            <w:tcW w:type="dxa" w:w="1296"/>
             <w:vAlign w:val="center"/>
           </w:tcPr>
           <w:p>
@@ -2980,26 +2193,11 @@
             </w:r>
           </w:p>
         </w:tc>
-        <w:tc>
-          <w:tcPr>
-            <w:tcW w:type="dxa" w:w="3456"/>
-            <w:vAlign w:val="center"/>
-          </w:tcPr>
-          <w:p>
-            <w:r>
-              <w:rPr>
-                <w:b w:val="0"/>
-                <w:i w:val="0"/>
-                <w:sz w:val="18"/>
-              </w:rPr>
-            </w:r>
-          </w:p>
-        </w:tc>
       </w:tr>
       <w:tr>
         <w:tc>
           <w:tcPr>
-            <w:tcW w:type="dxa" w:w="5760"/>
+            <w:tcW w:type="dxa" w:w="8064"/>
             <w:vAlign w:val="center"/>
           </w:tcPr>
           <w:p>
@@ -3015,7 +2213,7 @@
         </w:tc>
         <w:tc>
           <w:tcPr>
-            <w:tcW w:type="dxa" w:w="1152"/>
+            <w:tcW w:type="dxa" w:w="1296"/>
             <w:vAlign w:val="center"/>
           </w:tcPr>
           <w:p>
@@ -3032,26 +2230,11 @@
             </w:r>
           </w:p>
         </w:tc>
-        <w:tc>
-          <w:tcPr>
-            <w:tcW w:type="dxa" w:w="3456"/>
-            <w:vAlign w:val="center"/>
-          </w:tcPr>
-          <w:p>
-            <w:r>
-              <w:rPr>
-                <w:b w:val="0"/>
-                <w:i w:val="0"/>
-                <w:sz w:val="18"/>
-              </w:rPr>
-            </w:r>
-          </w:p>
-        </w:tc>
       </w:tr>
       <w:tr>
         <w:tc>
           <w:tcPr>
-            <w:tcW w:type="dxa" w:w="5760"/>
+            <w:tcW w:type="dxa" w:w="8064"/>
             <w:vAlign w:val="center"/>
           </w:tcPr>
           <w:p>
@@ -3067,7 +2250,7 @@
         </w:tc>
         <w:tc>
           <w:tcPr>
-            <w:tcW w:type="dxa" w:w="1152"/>
+            <w:tcW w:type="dxa" w:w="1296"/>
             <w:vAlign w:val="center"/>
           </w:tcPr>
           <w:p>
@@ -3084,26 +2267,11 @@
             </w:r>
           </w:p>
         </w:tc>
-        <w:tc>
-          <w:tcPr>
-            <w:tcW w:type="dxa" w:w="3456"/>
-            <w:vAlign w:val="center"/>
-          </w:tcPr>
-          <w:p>
-            <w:r>
-              <w:rPr>
-                <w:b w:val="0"/>
-                <w:i w:val="0"/>
-                <w:sz w:val="18"/>
-              </w:rPr>
-            </w:r>
-          </w:p>
-        </w:tc>
       </w:tr>
       <w:tr>
         <w:tc>
           <w:tcPr>
-            <w:tcW w:type="dxa" w:w="5760"/>
+            <w:tcW w:type="dxa" w:w="8064"/>
             <w:vAlign w:val="center"/>
           </w:tcPr>
           <w:p>
@@ -3119,7 +2287,7 @@
         </w:tc>
         <w:tc>
           <w:tcPr>
-            <w:tcW w:type="dxa" w:w="1152"/>
+            <w:tcW w:type="dxa" w:w="1296"/>
             <w:vAlign w:val="center"/>
           </w:tcPr>
           <w:p>
@@ -3136,26 +2304,11 @@
             </w:r>
           </w:p>
         </w:tc>
-        <w:tc>
-          <w:tcPr>
-            <w:tcW w:type="dxa" w:w="3456"/>
-            <w:vAlign w:val="center"/>
-          </w:tcPr>
-          <w:p>
-            <w:r>
-              <w:rPr>
-                <w:b w:val="0"/>
-                <w:i w:val="0"/>
-                <w:sz w:val="18"/>
-              </w:rPr>
-            </w:r>
-          </w:p>
-        </w:tc>
       </w:tr>
       <w:tr>
         <w:tc>
           <w:tcPr>
-            <w:tcW w:type="dxa" w:w="5760"/>
+            <w:tcW w:type="dxa" w:w="8064"/>
             <w:vAlign w:val="center"/>
           </w:tcPr>
           <w:p>
@@ -3171,7 +2324,7 @@
         </w:tc>
         <w:tc>
           <w:tcPr>
-            <w:tcW w:type="dxa" w:w="1152"/>
+            <w:tcW w:type="dxa" w:w="1296"/>
             <w:vAlign w:val="center"/>
           </w:tcPr>
           <w:p>
@@ -3188,26 +2341,11 @@
             </w:r>
           </w:p>
         </w:tc>
-        <w:tc>
-          <w:tcPr>
-            <w:tcW w:type="dxa" w:w="3456"/>
-            <w:vAlign w:val="center"/>
-          </w:tcPr>
-          <w:p>
-            <w:r>
-              <w:rPr>
-                <w:b w:val="0"/>
-                <w:i w:val="0"/>
-                <w:sz w:val="18"/>
-              </w:rPr>
-            </w:r>
-          </w:p>
-        </w:tc>
       </w:tr>
       <w:tr>
         <w:tc>
           <w:tcPr>
-            <w:tcW w:type="dxa" w:w="5760"/>
+            <w:tcW w:type="dxa" w:w="8064"/>
             <w:vAlign w:val="center"/>
           </w:tcPr>
           <w:p>
@@ -3223,7 +2361,7 @@
         </w:tc>
         <w:tc>
           <w:tcPr>
-            <w:tcW w:type="dxa" w:w="1152"/>
+            <w:tcW w:type="dxa" w:w="1296"/>
             <w:vAlign w:val="center"/>
           </w:tcPr>
           <w:p>
@@ -3240,26 +2378,11 @@
             </w:r>
           </w:p>
         </w:tc>
-        <w:tc>
-          <w:tcPr>
-            <w:tcW w:type="dxa" w:w="3456"/>
-            <w:vAlign w:val="center"/>
-          </w:tcPr>
-          <w:p>
-            <w:r>
-              <w:rPr>
-                <w:b w:val="0"/>
-                <w:i w:val="0"/>
-                <w:sz w:val="18"/>
-              </w:rPr>
-            </w:r>
-          </w:p>
-        </w:tc>
       </w:tr>
       <w:tr>
         <w:tc>
           <w:tcPr>
-            <w:tcW w:type="dxa" w:w="5760"/>
+            <w:tcW w:type="dxa" w:w="8064"/>
             <w:vAlign w:val="center"/>
           </w:tcPr>
           <w:p>
@@ -3275,7 +2398,7 @@
         </w:tc>
         <w:tc>
           <w:tcPr>
-            <w:tcW w:type="dxa" w:w="1152"/>
+            <w:tcW w:type="dxa" w:w="1296"/>
             <w:vAlign w:val="center"/>
           </w:tcPr>
           <w:p>
@@ -3292,27 +2415,12 @@
             </w:r>
           </w:p>
         </w:tc>
-        <w:tc>
-          <w:tcPr>
-            <w:tcW w:type="dxa" w:w="3456"/>
-            <w:vAlign w:val="center"/>
-          </w:tcPr>
-          <w:p>
-            <w:r>
-              <w:rPr>
-                <w:b w:val="0"/>
-                <w:i w:val="0"/>
-                <w:sz w:val="18"/>
-              </w:rPr>
-            </w:r>
-          </w:p>
-        </w:tc>
       </w:tr>
       <w:tr>
         <w:tc>
           <w:tcPr>
-            <w:tcW w:type="dxa" w:w="10368"/>
-            <w:gridSpan w:val="3"/>
+            <w:tcW w:type="dxa" w:w="9360"/>
+            <w:gridSpan w:val="2"/>
             <w:vAlign w:val="center"/>
             <w:shd w:val="clear" w:fill="DCE6F1"/>
           </w:tcPr>
@@ -3332,7 +2440,7 @@
       <w:tr>
         <w:tc>
           <w:tcPr>
-            <w:tcW w:type="dxa" w:w="5760"/>
+            <w:tcW w:type="dxa" w:w="8064"/>
             <w:vAlign w:val="center"/>
           </w:tcPr>
           <w:p>
@@ -3348,7 +2456,7 @@
         </w:tc>
         <w:tc>
           <w:tcPr>
-            <w:tcW w:type="dxa" w:w="1152"/>
+            <w:tcW w:type="dxa" w:w="1296"/>
             <w:vAlign w:val="center"/>
           </w:tcPr>
           <w:p>
@@ -3365,26 +2473,11 @@
             </w:r>
           </w:p>
         </w:tc>
-        <w:tc>
-          <w:tcPr>
-            <w:tcW w:type="dxa" w:w="3456"/>
-            <w:vAlign w:val="center"/>
-          </w:tcPr>
-          <w:p>
-            <w:r>
-              <w:rPr>
-                <w:b w:val="0"/>
-                <w:i w:val="0"/>
-                <w:sz w:val="18"/>
-              </w:rPr>
-            </w:r>
-          </w:p>
-        </w:tc>
       </w:tr>
       <w:tr>
         <w:tc>
           <w:tcPr>
-            <w:tcW w:type="dxa" w:w="5760"/>
+            <w:tcW w:type="dxa" w:w="8064"/>
             <w:vAlign w:val="center"/>
           </w:tcPr>
           <w:p>
@@ -3400,7 +2493,7 @@
         </w:tc>
         <w:tc>
           <w:tcPr>
-            <w:tcW w:type="dxa" w:w="1152"/>
+            <w:tcW w:type="dxa" w:w="1296"/>
             <w:vAlign w:val="center"/>
           </w:tcPr>
           <w:p>
@@ -3417,26 +2510,11 @@
             </w:r>
           </w:p>
         </w:tc>
-        <w:tc>
-          <w:tcPr>
-            <w:tcW w:type="dxa" w:w="3456"/>
-            <w:vAlign w:val="center"/>
-          </w:tcPr>
-          <w:p>
-            <w:r>
-              <w:rPr>
-                <w:b w:val="0"/>
-                <w:i w:val="0"/>
-                <w:sz w:val="18"/>
-              </w:rPr>
-            </w:r>
-          </w:p>
-        </w:tc>
       </w:tr>
       <w:tr>
         <w:tc>
           <w:tcPr>
-            <w:tcW w:type="dxa" w:w="5760"/>
+            <w:tcW w:type="dxa" w:w="8064"/>
             <w:vAlign w:val="center"/>
           </w:tcPr>
           <w:p>
@@ -3452,7 +2530,7 @@
         </w:tc>
         <w:tc>
           <w:tcPr>
-            <w:tcW w:type="dxa" w:w="1152"/>
+            <w:tcW w:type="dxa" w:w="1296"/>
             <w:vAlign w:val="center"/>
           </w:tcPr>
           <w:p>
@@ -3469,26 +2547,11 @@
             </w:r>
           </w:p>
         </w:tc>
-        <w:tc>
-          <w:tcPr>
-            <w:tcW w:type="dxa" w:w="3456"/>
-            <w:vAlign w:val="center"/>
-          </w:tcPr>
-          <w:p>
-            <w:r>
-              <w:rPr>
-                <w:b w:val="0"/>
-                <w:i w:val="0"/>
-                <w:sz w:val="18"/>
-              </w:rPr>
-            </w:r>
-          </w:p>
-        </w:tc>
       </w:tr>
       <w:tr>
         <w:tc>
           <w:tcPr>
-            <w:tcW w:type="dxa" w:w="5760"/>
+            <w:tcW w:type="dxa" w:w="8064"/>
             <w:vAlign w:val="center"/>
           </w:tcPr>
           <w:p>
@@ -3504,7 +2567,7 @@
         </w:tc>
         <w:tc>
           <w:tcPr>
-            <w:tcW w:type="dxa" w:w="1152"/>
+            <w:tcW w:type="dxa" w:w="1296"/>
             <w:vAlign w:val="center"/>
           </w:tcPr>
           <w:p>
@@ -3521,26 +2584,11 @@
             </w:r>
           </w:p>
         </w:tc>
-        <w:tc>
-          <w:tcPr>
-            <w:tcW w:type="dxa" w:w="3456"/>
-            <w:vAlign w:val="center"/>
-          </w:tcPr>
-          <w:p>
-            <w:r>
-              <w:rPr>
-                <w:b w:val="0"/>
-                <w:i w:val="0"/>
-                <w:sz w:val="18"/>
-              </w:rPr>
-            </w:r>
-          </w:p>
-        </w:tc>
       </w:tr>
       <w:tr>
         <w:tc>
           <w:tcPr>
-            <w:tcW w:type="dxa" w:w="5760"/>
+            <w:tcW w:type="dxa" w:w="8064"/>
             <w:vAlign w:val="center"/>
           </w:tcPr>
           <w:p>
@@ -3556,7 +2604,7 @@
         </w:tc>
         <w:tc>
           <w:tcPr>
-            <w:tcW w:type="dxa" w:w="1152"/>
+            <w:tcW w:type="dxa" w:w="1296"/>
             <w:vAlign w:val="center"/>
           </w:tcPr>
           <w:p>
@@ -3573,26 +2621,11 @@
             </w:r>
           </w:p>
         </w:tc>
-        <w:tc>
-          <w:tcPr>
-            <w:tcW w:type="dxa" w:w="3456"/>
-            <w:vAlign w:val="center"/>
-          </w:tcPr>
-          <w:p>
-            <w:r>
-              <w:rPr>
-                <w:b w:val="0"/>
-                <w:i w:val="0"/>
-                <w:sz w:val="18"/>
-              </w:rPr>
-            </w:r>
-          </w:p>
-        </w:tc>
       </w:tr>
       <w:tr>
         <w:tc>
           <w:tcPr>
-            <w:tcW w:type="dxa" w:w="5760"/>
+            <w:tcW w:type="dxa" w:w="8064"/>
             <w:vAlign w:val="center"/>
           </w:tcPr>
           <w:p>
@@ -3608,7 +2641,7 @@
         </w:tc>
         <w:tc>
           <w:tcPr>
-            <w:tcW w:type="dxa" w:w="1152"/>
+            <w:tcW w:type="dxa" w:w="1296"/>
             <w:vAlign w:val="center"/>
           </w:tcPr>
           <w:p>
@@ -3625,26 +2658,11 @@
             </w:r>
           </w:p>
         </w:tc>
-        <w:tc>
-          <w:tcPr>
-            <w:tcW w:type="dxa" w:w="3456"/>
-            <w:vAlign w:val="center"/>
-          </w:tcPr>
-          <w:p>
-            <w:r>
-              <w:rPr>
-                <w:b w:val="0"/>
-                <w:i w:val="0"/>
-                <w:sz w:val="18"/>
-              </w:rPr>
-            </w:r>
-          </w:p>
-        </w:tc>
       </w:tr>
       <w:tr>
         <w:tc>
           <w:tcPr>
-            <w:tcW w:type="dxa" w:w="5760"/>
+            <w:tcW w:type="dxa" w:w="8064"/>
             <w:vAlign w:val="center"/>
           </w:tcPr>
           <w:p>
@@ -3660,7 +2678,7 @@
         </w:tc>
         <w:tc>
           <w:tcPr>
-            <w:tcW w:type="dxa" w:w="1152"/>
+            <w:tcW w:type="dxa" w:w="1296"/>
             <w:vAlign w:val="center"/>
           </w:tcPr>
           <w:p>
@@ -3677,27 +2695,12 @@
             </w:r>
           </w:p>
         </w:tc>
-        <w:tc>
-          <w:tcPr>
-            <w:tcW w:type="dxa" w:w="3456"/>
-            <w:vAlign w:val="center"/>
-          </w:tcPr>
-          <w:p>
-            <w:r>
-              <w:rPr>
-                <w:b w:val="0"/>
-                <w:i w:val="0"/>
-                <w:sz w:val="18"/>
-              </w:rPr>
-            </w:r>
-          </w:p>
-        </w:tc>
       </w:tr>
       <w:tr>
         <w:tc>
           <w:tcPr>
-            <w:tcW w:type="dxa" w:w="10368"/>
-            <w:gridSpan w:val="3"/>
+            <w:tcW w:type="dxa" w:w="9360"/>
+            <w:gridSpan w:val="2"/>
             <w:vAlign w:val="center"/>
             <w:shd w:val="clear" w:fill="DCE6F1"/>
           </w:tcPr>
@@ -3717,7 +2720,7 @@
       <w:tr>
         <w:tc>
           <w:tcPr>
-            <w:tcW w:type="dxa" w:w="5760"/>
+            <w:tcW w:type="dxa" w:w="8064"/>
             <w:vAlign w:val="center"/>
           </w:tcPr>
           <w:p>
@@ -3733,7 +2736,7 @@
         </w:tc>
         <w:tc>
           <w:tcPr>
-            <w:tcW w:type="dxa" w:w="1152"/>
+            <w:tcW w:type="dxa" w:w="1296"/>
             <w:vAlign w:val="center"/>
           </w:tcPr>
           <w:p>
@@ -3750,26 +2753,11 @@
             </w:r>
           </w:p>
         </w:tc>
-        <w:tc>
-          <w:tcPr>
-            <w:tcW w:type="dxa" w:w="3456"/>
-            <w:vAlign w:val="center"/>
-          </w:tcPr>
-          <w:p>
-            <w:r>
-              <w:rPr>
-                <w:b w:val="0"/>
-                <w:i w:val="0"/>
-                <w:sz w:val="18"/>
-              </w:rPr>
-            </w:r>
-          </w:p>
-        </w:tc>
       </w:tr>
       <w:tr>
         <w:tc>
           <w:tcPr>
-            <w:tcW w:type="dxa" w:w="5760"/>
+            <w:tcW w:type="dxa" w:w="8064"/>
             <w:vAlign w:val="center"/>
           </w:tcPr>
           <w:p>
@@ -3785,7 +2773,7 @@
         </w:tc>
         <w:tc>
           <w:tcPr>
-            <w:tcW w:type="dxa" w:w="1152"/>
+            <w:tcW w:type="dxa" w:w="1296"/>
             <w:vAlign w:val="center"/>
           </w:tcPr>
           <w:p>
@@ -3802,26 +2790,11 @@
             </w:r>
           </w:p>
         </w:tc>
-        <w:tc>
-          <w:tcPr>
-            <w:tcW w:type="dxa" w:w="3456"/>
-            <w:vAlign w:val="center"/>
-          </w:tcPr>
-          <w:p>
-            <w:r>
-              <w:rPr>
-                <w:b w:val="0"/>
-                <w:i w:val="0"/>
-                <w:sz w:val="18"/>
-              </w:rPr>
-            </w:r>
-          </w:p>
-        </w:tc>
       </w:tr>
       <w:tr>
         <w:tc>
           <w:tcPr>
-            <w:tcW w:type="dxa" w:w="5760"/>
+            <w:tcW w:type="dxa" w:w="8064"/>
             <w:vAlign w:val="center"/>
           </w:tcPr>
           <w:p>
@@ -3837,7 +2810,7 @@
         </w:tc>
         <w:tc>
           <w:tcPr>
-            <w:tcW w:type="dxa" w:w="1152"/>
+            <w:tcW w:type="dxa" w:w="1296"/>
             <w:vAlign w:val="center"/>
           </w:tcPr>
           <w:p>
@@ -3854,26 +2827,11 @@
             </w:r>
           </w:p>
         </w:tc>
-        <w:tc>
-          <w:tcPr>
-            <w:tcW w:type="dxa" w:w="3456"/>
-            <w:vAlign w:val="center"/>
-          </w:tcPr>
-          <w:p>
-            <w:r>
-              <w:rPr>
-                <w:b w:val="0"/>
-                <w:i w:val="0"/>
-                <w:sz w:val="18"/>
-              </w:rPr>
-            </w:r>
-          </w:p>
-        </w:tc>
       </w:tr>
       <w:tr>
         <w:tc>
           <w:tcPr>
-            <w:tcW w:type="dxa" w:w="5760"/>
+            <w:tcW w:type="dxa" w:w="8064"/>
             <w:vAlign w:val="center"/>
           </w:tcPr>
           <w:p>
@@ -3889,7 +2847,7 @@
         </w:tc>
         <w:tc>
           <w:tcPr>
-            <w:tcW w:type="dxa" w:w="1152"/>
+            <w:tcW w:type="dxa" w:w="1296"/>
             <w:vAlign w:val="center"/>
           </w:tcPr>
           <w:p>
@@ -3906,26 +2864,11 @@
             </w:r>
           </w:p>
         </w:tc>
-        <w:tc>
-          <w:tcPr>
-            <w:tcW w:type="dxa" w:w="3456"/>
-            <w:vAlign w:val="center"/>
-          </w:tcPr>
-          <w:p>
-            <w:r>
-              <w:rPr>
-                <w:b w:val="0"/>
-                <w:i w:val="0"/>
-                <w:sz w:val="18"/>
-              </w:rPr>
-            </w:r>
-          </w:p>
-        </w:tc>
       </w:tr>
       <w:tr>
         <w:tc>
           <w:tcPr>
-            <w:tcW w:type="dxa" w:w="5760"/>
+            <w:tcW w:type="dxa" w:w="8064"/>
             <w:vAlign w:val="center"/>
           </w:tcPr>
           <w:p>
@@ -3941,7 +2884,7 @@
         </w:tc>
         <w:tc>
           <w:tcPr>
-            <w:tcW w:type="dxa" w:w="1152"/>
+            <w:tcW w:type="dxa" w:w="1296"/>
             <w:vAlign w:val="center"/>
           </w:tcPr>
           <w:p>
@@ -3958,26 +2901,11 @@
             </w:r>
           </w:p>
         </w:tc>
-        <w:tc>
-          <w:tcPr>
-            <w:tcW w:type="dxa" w:w="3456"/>
-            <w:vAlign w:val="center"/>
-          </w:tcPr>
-          <w:p>
-            <w:r>
-              <w:rPr>
-                <w:b w:val="0"/>
-                <w:i w:val="0"/>
-                <w:sz w:val="18"/>
-              </w:rPr>
-            </w:r>
-          </w:p>
-        </w:tc>
       </w:tr>
       <w:tr>
         <w:tc>
           <w:tcPr>
-            <w:tcW w:type="dxa" w:w="5760"/>
+            <w:tcW w:type="dxa" w:w="8064"/>
             <w:vAlign w:val="center"/>
           </w:tcPr>
           <w:p>
@@ -3993,7 +2921,7 @@
         </w:tc>
         <w:tc>
           <w:tcPr>
-            <w:tcW w:type="dxa" w:w="1152"/>
+            <w:tcW w:type="dxa" w:w="1296"/>
             <w:vAlign w:val="center"/>
           </w:tcPr>
           <w:p>
@@ -4010,26 +2938,11 @@
             </w:r>
           </w:p>
         </w:tc>
-        <w:tc>
-          <w:tcPr>
-            <w:tcW w:type="dxa" w:w="3456"/>
-            <w:vAlign w:val="center"/>
-          </w:tcPr>
-          <w:p>
-            <w:r>
-              <w:rPr>
-                <w:b w:val="0"/>
-                <w:i w:val="0"/>
-                <w:sz w:val="18"/>
-              </w:rPr>
-            </w:r>
-          </w:p>
-        </w:tc>
       </w:tr>
       <w:tr>
         <w:tc>
           <w:tcPr>
-            <w:tcW w:type="dxa" w:w="5760"/>
+            <w:tcW w:type="dxa" w:w="8064"/>
             <w:vAlign w:val="center"/>
           </w:tcPr>
           <w:p>
@@ -4045,7 +2958,7 @@
         </w:tc>
         <w:tc>
           <w:tcPr>
-            <w:tcW w:type="dxa" w:w="1152"/>
+            <w:tcW w:type="dxa" w:w="1296"/>
             <w:vAlign w:val="center"/>
           </w:tcPr>
           <w:p>
@@ -4062,27 +2975,12 @@
             </w:r>
           </w:p>
         </w:tc>
-        <w:tc>
-          <w:tcPr>
-            <w:tcW w:type="dxa" w:w="3456"/>
-            <w:vAlign w:val="center"/>
-          </w:tcPr>
-          <w:p>
-            <w:r>
-              <w:rPr>
-                <w:b w:val="0"/>
-                <w:i w:val="0"/>
-                <w:sz w:val="18"/>
-              </w:rPr>
-            </w:r>
-          </w:p>
-        </w:tc>
       </w:tr>
       <w:tr>
         <w:tc>
           <w:tcPr>
-            <w:tcW w:type="dxa" w:w="10368"/>
-            <w:gridSpan w:val="3"/>
+            <w:tcW w:type="dxa" w:w="9360"/>
+            <w:gridSpan w:val="2"/>
             <w:vAlign w:val="center"/>
             <w:shd w:val="clear" w:fill="DCE6F1"/>
           </w:tcPr>
@@ -4102,7 +3000,7 @@
       <w:tr>
         <w:tc>
           <w:tcPr>
-            <w:tcW w:type="dxa" w:w="5760"/>
+            <w:tcW w:type="dxa" w:w="8064"/>
             <w:vAlign w:val="center"/>
           </w:tcPr>
           <w:p>
@@ -4118,7 +3016,7 @@
         </w:tc>
         <w:tc>
           <w:tcPr>
-            <w:tcW w:type="dxa" w:w="1152"/>
+            <w:tcW w:type="dxa" w:w="1296"/>
             <w:vAlign w:val="center"/>
           </w:tcPr>
           <w:p>
@@ -4135,26 +3033,11 @@
             </w:r>
           </w:p>
         </w:tc>
-        <w:tc>
-          <w:tcPr>
-            <w:tcW w:type="dxa" w:w="3456"/>
-            <w:vAlign w:val="center"/>
-          </w:tcPr>
-          <w:p>
-            <w:r>
-              <w:rPr>
-                <w:b w:val="0"/>
-                <w:i w:val="0"/>
-                <w:sz w:val="18"/>
-              </w:rPr>
-            </w:r>
-          </w:p>
-        </w:tc>
       </w:tr>
       <w:tr>
         <w:tc>
           <w:tcPr>
-            <w:tcW w:type="dxa" w:w="5760"/>
+            <w:tcW w:type="dxa" w:w="8064"/>
             <w:vAlign w:val="center"/>
           </w:tcPr>
           <w:p>
@@ -4170,7 +3053,7 @@
         </w:tc>
         <w:tc>
           <w:tcPr>
-            <w:tcW w:type="dxa" w:w="1152"/>
+            <w:tcW w:type="dxa" w:w="1296"/>
             <w:vAlign w:val="center"/>
           </w:tcPr>
           <w:p>
@@ -4187,26 +3070,11 @@
             </w:r>
           </w:p>
         </w:tc>
-        <w:tc>
-          <w:tcPr>
-            <w:tcW w:type="dxa" w:w="3456"/>
-            <w:vAlign w:val="center"/>
-          </w:tcPr>
-          <w:p>
-            <w:r>
-              <w:rPr>
-                <w:b w:val="0"/>
-                <w:i w:val="0"/>
-                <w:sz w:val="18"/>
-              </w:rPr>
-            </w:r>
-          </w:p>
-        </w:tc>
       </w:tr>
       <w:tr>
         <w:tc>
           <w:tcPr>
-            <w:tcW w:type="dxa" w:w="5760"/>
+            <w:tcW w:type="dxa" w:w="8064"/>
             <w:vAlign w:val="center"/>
           </w:tcPr>
           <w:p>
@@ -4222,7 +3090,7 @@
         </w:tc>
         <w:tc>
           <w:tcPr>
-            <w:tcW w:type="dxa" w:w="1152"/>
+            <w:tcW w:type="dxa" w:w="1296"/>
             <w:vAlign w:val="center"/>
           </w:tcPr>
           <w:p>
@@ -4239,26 +3107,11 @@
             </w:r>
           </w:p>
         </w:tc>
-        <w:tc>
-          <w:tcPr>
-            <w:tcW w:type="dxa" w:w="3456"/>
-            <w:vAlign w:val="center"/>
-          </w:tcPr>
-          <w:p>
-            <w:r>
-              <w:rPr>
-                <w:b w:val="0"/>
-                <w:i w:val="0"/>
-                <w:sz w:val="18"/>
-              </w:rPr>
-            </w:r>
-          </w:p>
-        </w:tc>
       </w:tr>
       <w:tr>
         <w:tc>
           <w:tcPr>
-            <w:tcW w:type="dxa" w:w="5760"/>
+            <w:tcW w:type="dxa" w:w="8064"/>
             <w:vAlign w:val="center"/>
           </w:tcPr>
           <w:p>
@@ -4274,7 +3127,7 @@
         </w:tc>
         <w:tc>
           <w:tcPr>
-            <w:tcW w:type="dxa" w:w="1152"/>
+            <w:tcW w:type="dxa" w:w="1296"/>
             <w:vAlign w:val="center"/>
           </w:tcPr>
           <w:p>
@@ -4291,26 +3144,11 @@
             </w:r>
           </w:p>
         </w:tc>
-        <w:tc>
-          <w:tcPr>
-            <w:tcW w:type="dxa" w:w="3456"/>
-            <w:vAlign w:val="center"/>
-          </w:tcPr>
-          <w:p>
-            <w:r>
-              <w:rPr>
-                <w:b w:val="0"/>
-                <w:i w:val="0"/>
-                <w:sz w:val="18"/>
-              </w:rPr>
-            </w:r>
-          </w:p>
-        </w:tc>
       </w:tr>
       <w:tr>
         <w:tc>
           <w:tcPr>
-            <w:tcW w:type="dxa" w:w="5760"/>
+            <w:tcW w:type="dxa" w:w="8064"/>
             <w:vAlign w:val="center"/>
           </w:tcPr>
           <w:p>
@@ -4326,7 +3164,7 @@
         </w:tc>
         <w:tc>
           <w:tcPr>
-            <w:tcW w:type="dxa" w:w="1152"/>
+            <w:tcW w:type="dxa" w:w="1296"/>
             <w:vAlign w:val="center"/>
           </w:tcPr>
           <w:p>
@@ -4343,26 +3181,11 @@
             </w:r>
           </w:p>
         </w:tc>
-        <w:tc>
-          <w:tcPr>
-            <w:tcW w:type="dxa" w:w="3456"/>
-            <w:vAlign w:val="center"/>
-          </w:tcPr>
-          <w:p>
-            <w:r>
-              <w:rPr>
-                <w:b w:val="0"/>
-                <w:i w:val="0"/>
-                <w:sz w:val="18"/>
-              </w:rPr>
-            </w:r>
-          </w:p>
-        </w:tc>
       </w:tr>
       <w:tr>
         <w:tc>
           <w:tcPr>
-            <w:tcW w:type="dxa" w:w="5760"/>
+            <w:tcW w:type="dxa" w:w="8064"/>
             <w:vAlign w:val="center"/>
           </w:tcPr>
           <w:p>
@@ -4378,7 +3201,7 @@
         </w:tc>
         <w:tc>
           <w:tcPr>
-            <w:tcW w:type="dxa" w:w="1152"/>
+            <w:tcW w:type="dxa" w:w="1296"/>
             <w:vAlign w:val="center"/>
           </w:tcPr>
           <w:p>
@@ -4395,26 +3218,11 @@
             </w:r>
           </w:p>
         </w:tc>
-        <w:tc>
-          <w:tcPr>
-            <w:tcW w:type="dxa" w:w="3456"/>
-            <w:vAlign w:val="center"/>
-          </w:tcPr>
-          <w:p>
-            <w:r>
-              <w:rPr>
-                <w:b w:val="0"/>
-                <w:i w:val="0"/>
-                <w:sz w:val="18"/>
-              </w:rPr>
-            </w:r>
-          </w:p>
-        </w:tc>
       </w:tr>
       <w:tr>
         <w:tc>
           <w:tcPr>
-            <w:tcW w:type="dxa" w:w="5760"/>
+            <w:tcW w:type="dxa" w:w="8064"/>
             <w:vAlign w:val="center"/>
           </w:tcPr>
           <w:p>
@@ -4430,7 +3238,7 @@
         </w:tc>
         <w:tc>
           <w:tcPr>
-            <w:tcW w:type="dxa" w:w="1152"/>
+            <w:tcW w:type="dxa" w:w="1296"/>
             <w:vAlign w:val="center"/>
           </w:tcPr>
           <w:p>
@@ -4447,26 +3255,11 @@
             </w:r>
           </w:p>
         </w:tc>
-        <w:tc>
-          <w:tcPr>
-            <w:tcW w:type="dxa" w:w="3456"/>
-            <w:vAlign w:val="center"/>
-          </w:tcPr>
-          <w:p>
-            <w:r>
-              <w:rPr>
-                <w:b w:val="0"/>
-                <w:i w:val="0"/>
-                <w:sz w:val="18"/>
-              </w:rPr>
-            </w:r>
-          </w:p>
-        </w:tc>
       </w:tr>
       <w:tr>
         <w:tc>
           <w:tcPr>
-            <w:tcW w:type="dxa" w:w="5760"/>
+            <w:tcW w:type="dxa" w:w="8064"/>
             <w:vAlign w:val="center"/>
           </w:tcPr>
           <w:p>
@@ -4482,7 +3275,7 @@
         </w:tc>
         <w:tc>
           <w:tcPr>
-            <w:tcW w:type="dxa" w:w="1152"/>
+            <w:tcW w:type="dxa" w:w="1296"/>
             <w:vAlign w:val="center"/>
           </w:tcPr>
           <w:p>
@@ -4499,26 +3292,11 @@
             </w:r>
           </w:p>
         </w:tc>
-        <w:tc>
-          <w:tcPr>
-            <w:tcW w:type="dxa" w:w="3456"/>
-            <w:vAlign w:val="center"/>
-          </w:tcPr>
-          <w:p>
-            <w:r>
-              <w:rPr>
-                <w:b w:val="0"/>
-                <w:i w:val="0"/>
-                <w:sz w:val="18"/>
-              </w:rPr>
-            </w:r>
-          </w:p>
-        </w:tc>
       </w:tr>
       <w:tr>
         <w:tc>
           <w:tcPr>
-            <w:tcW w:type="dxa" w:w="5760"/>
+            <w:tcW w:type="dxa" w:w="8064"/>
             <w:vAlign w:val="center"/>
           </w:tcPr>
           <w:p>
@@ -4534,7 +3312,7 @@
         </w:tc>
         <w:tc>
           <w:tcPr>
-            <w:tcW w:type="dxa" w:w="1152"/>
+            <w:tcW w:type="dxa" w:w="1296"/>
             <w:vAlign w:val="center"/>
           </w:tcPr>
           <w:p>
@@ -4551,27 +3329,12 @@
             </w:r>
           </w:p>
         </w:tc>
-        <w:tc>
-          <w:tcPr>
-            <w:tcW w:type="dxa" w:w="3456"/>
-            <w:vAlign w:val="center"/>
-          </w:tcPr>
-          <w:p>
-            <w:r>
-              <w:rPr>
-                <w:b w:val="0"/>
-                <w:i w:val="0"/>
-                <w:sz w:val="18"/>
-              </w:rPr>
-            </w:r>
-          </w:p>
-        </w:tc>
       </w:tr>
       <w:tr>
         <w:tc>
           <w:tcPr>
-            <w:tcW w:type="dxa" w:w="10368"/>
-            <w:gridSpan w:val="3"/>
+            <w:tcW w:type="dxa" w:w="9360"/>
+            <w:gridSpan w:val="2"/>
             <w:vAlign w:val="center"/>
             <w:shd w:val="clear" w:fill="DCE6F1"/>
           </w:tcPr>
@@ -4591,7 +3354,7 @@
       <w:tr>
         <w:tc>
           <w:tcPr>
-            <w:tcW w:type="dxa" w:w="5760"/>
+            <w:tcW w:type="dxa" w:w="8064"/>
             <w:vAlign w:val="center"/>
           </w:tcPr>
           <w:p>
@@ -4607,7 +3370,7 @@
         </w:tc>
         <w:tc>
           <w:tcPr>
-            <w:tcW w:type="dxa" w:w="1152"/>
+            <w:tcW w:type="dxa" w:w="1296"/>
             <w:vAlign w:val="center"/>
           </w:tcPr>
           <w:p>
@@ -4624,26 +3387,11 @@
             </w:r>
           </w:p>
         </w:tc>
-        <w:tc>
-          <w:tcPr>
-            <w:tcW w:type="dxa" w:w="3456"/>
-            <w:vAlign w:val="center"/>
-          </w:tcPr>
-          <w:p>
-            <w:r>
-              <w:rPr>
-                <w:b w:val="0"/>
-                <w:i w:val="0"/>
-                <w:sz w:val="18"/>
-              </w:rPr>
-            </w:r>
-          </w:p>
-        </w:tc>
       </w:tr>
       <w:tr>
         <w:tc>
           <w:tcPr>
-            <w:tcW w:type="dxa" w:w="5760"/>
+            <w:tcW w:type="dxa" w:w="8064"/>
             <w:vAlign w:val="center"/>
           </w:tcPr>
           <w:p>
@@ -4659,7 +3407,7 @@
         </w:tc>
         <w:tc>
           <w:tcPr>
-            <w:tcW w:type="dxa" w:w="1152"/>
+            <w:tcW w:type="dxa" w:w="1296"/>
             <w:vAlign w:val="center"/>
           </w:tcPr>
           <w:p>
@@ -4676,27 +3424,12 @@
             </w:r>
           </w:p>
         </w:tc>
-        <w:tc>
-          <w:tcPr>
-            <w:tcW w:type="dxa" w:w="3456"/>
-            <w:vAlign w:val="center"/>
-          </w:tcPr>
-          <w:p>
-            <w:r>
-              <w:rPr>
-                <w:b w:val="0"/>
-                <w:i w:val="0"/>
-                <w:sz w:val="18"/>
-              </w:rPr>
-            </w:r>
-          </w:p>
-        </w:tc>
       </w:tr>
       <w:tr>
         <w:tc>
           <w:tcPr>
-            <w:tcW w:type="dxa" w:w="10368"/>
-            <w:gridSpan w:val="3"/>
+            <w:tcW w:type="dxa" w:w="9360"/>
+            <w:gridSpan w:val="2"/>
             <w:vAlign w:val="center"/>
             <w:shd w:val="clear" w:fill="DCE6F1"/>
           </w:tcPr>
@@ -4716,7 +3449,7 @@
       <w:tr>
         <w:tc>
           <w:tcPr>
-            <w:tcW w:type="dxa" w:w="5760"/>
+            <w:tcW w:type="dxa" w:w="8064"/>
             <w:vAlign w:val="center"/>
           </w:tcPr>
           <w:p>
@@ -4732,7 +3465,7 @@
         </w:tc>
         <w:tc>
           <w:tcPr>
-            <w:tcW w:type="dxa" w:w="1152"/>
+            <w:tcW w:type="dxa" w:w="1296"/>
             <w:vAlign w:val="center"/>
           </w:tcPr>
           <w:p>
@@ -4749,26 +3482,11 @@
             </w:r>
           </w:p>
         </w:tc>
-        <w:tc>
-          <w:tcPr>
-            <w:tcW w:type="dxa" w:w="3456"/>
-            <w:vAlign w:val="center"/>
-          </w:tcPr>
-          <w:p>
-            <w:r>
-              <w:rPr>
-                <w:b w:val="0"/>
-                <w:i w:val="0"/>
-                <w:sz w:val="18"/>
-              </w:rPr>
-            </w:r>
-          </w:p>
-        </w:tc>
       </w:tr>
       <w:tr>
         <w:tc>
           <w:tcPr>
-            <w:tcW w:type="dxa" w:w="5760"/>
+            <w:tcW w:type="dxa" w:w="8064"/>
             <w:vAlign w:val="center"/>
           </w:tcPr>
           <w:p>
@@ -4784,7 +3502,7 @@
         </w:tc>
         <w:tc>
           <w:tcPr>
-            <w:tcW w:type="dxa" w:w="1152"/>
+            <w:tcW w:type="dxa" w:w="1296"/>
             <w:vAlign w:val="center"/>
           </w:tcPr>
           <w:p>
@@ -4801,26 +3519,11 @@
             </w:r>
           </w:p>
         </w:tc>
-        <w:tc>
-          <w:tcPr>
-            <w:tcW w:type="dxa" w:w="3456"/>
-            <w:vAlign w:val="center"/>
-          </w:tcPr>
-          <w:p>
-            <w:r>
-              <w:rPr>
-                <w:b w:val="0"/>
-                <w:i w:val="0"/>
-                <w:sz w:val="18"/>
-              </w:rPr>
-            </w:r>
-          </w:p>
-        </w:tc>
       </w:tr>
       <w:tr>
         <w:tc>
           <w:tcPr>
-            <w:tcW w:type="dxa" w:w="5760"/>
+            <w:tcW w:type="dxa" w:w="8064"/>
             <w:vAlign w:val="center"/>
           </w:tcPr>
           <w:p>
@@ -4836,7 +3539,7 @@
         </w:tc>
         <w:tc>
           <w:tcPr>
-            <w:tcW w:type="dxa" w:w="1152"/>
+            <w:tcW w:type="dxa" w:w="1296"/>
             <w:vAlign w:val="center"/>
           </w:tcPr>
           <w:p>
@@ -4853,26 +3556,11 @@
             </w:r>
           </w:p>
         </w:tc>
-        <w:tc>
-          <w:tcPr>
-            <w:tcW w:type="dxa" w:w="3456"/>
-            <w:vAlign w:val="center"/>
-          </w:tcPr>
-          <w:p>
-            <w:r>
-              <w:rPr>
-                <w:b w:val="0"/>
-                <w:i w:val="0"/>
-                <w:sz w:val="18"/>
-              </w:rPr>
-            </w:r>
-          </w:p>
-        </w:tc>
       </w:tr>
       <w:tr>
         <w:tc>
           <w:tcPr>
-            <w:tcW w:type="dxa" w:w="5760"/>
+            <w:tcW w:type="dxa" w:w="8064"/>
             <w:vAlign w:val="center"/>
           </w:tcPr>
           <w:p>
@@ -4888,7 +3576,7 @@
         </w:tc>
         <w:tc>
           <w:tcPr>
-            <w:tcW w:type="dxa" w:w="1152"/>
+            <w:tcW w:type="dxa" w:w="1296"/>
             <w:vAlign w:val="center"/>
           </w:tcPr>
           <w:p>
@@ -4905,26 +3593,11 @@
             </w:r>
           </w:p>
         </w:tc>
-        <w:tc>
-          <w:tcPr>
-            <w:tcW w:type="dxa" w:w="3456"/>
-            <w:vAlign w:val="center"/>
-          </w:tcPr>
-          <w:p>
-            <w:r>
-              <w:rPr>
-                <w:b w:val="0"/>
-                <w:i w:val="0"/>
-                <w:sz w:val="18"/>
-              </w:rPr>
-            </w:r>
-          </w:p>
-        </w:tc>
       </w:tr>
       <w:tr>
         <w:tc>
           <w:tcPr>
-            <w:tcW w:type="dxa" w:w="5760"/>
+            <w:tcW w:type="dxa" w:w="8064"/>
             <w:vAlign w:val="center"/>
           </w:tcPr>
           <w:p>
@@ -4940,7 +3613,7 @@
         </w:tc>
         <w:tc>
           <w:tcPr>
-            <w:tcW w:type="dxa" w:w="1152"/>
+            <w:tcW w:type="dxa" w:w="1296"/>
             <w:vAlign w:val="center"/>
           </w:tcPr>
           <w:p>
@@ -4957,26 +3630,11 @@
             </w:r>
           </w:p>
         </w:tc>
-        <w:tc>
-          <w:tcPr>
-            <w:tcW w:type="dxa" w:w="3456"/>
-            <w:vAlign w:val="center"/>
-          </w:tcPr>
-          <w:p>
-            <w:r>
-              <w:rPr>
-                <w:b w:val="0"/>
-                <w:i w:val="0"/>
-                <w:sz w:val="18"/>
-              </w:rPr>
-            </w:r>
-          </w:p>
-        </w:tc>
       </w:tr>
       <w:tr>
         <w:tc>
           <w:tcPr>
-            <w:tcW w:type="dxa" w:w="5760"/>
+            <w:tcW w:type="dxa" w:w="8064"/>
             <w:vAlign w:val="center"/>
           </w:tcPr>
           <w:p>
@@ -4992,7 +3650,7 @@
         </w:tc>
         <w:tc>
           <w:tcPr>
-            <w:tcW w:type="dxa" w:w="1152"/>
+            <w:tcW w:type="dxa" w:w="1296"/>
             <w:vAlign w:val="center"/>
           </w:tcPr>
           <w:p>
@@ -5009,27 +3667,12 @@
             </w:r>
           </w:p>
         </w:tc>
-        <w:tc>
-          <w:tcPr>
-            <w:tcW w:type="dxa" w:w="3456"/>
-            <w:vAlign w:val="center"/>
-          </w:tcPr>
-          <w:p>
-            <w:r>
-              <w:rPr>
-                <w:b w:val="0"/>
-                <w:i w:val="0"/>
-                <w:sz w:val="18"/>
-              </w:rPr>
-            </w:r>
-          </w:p>
-        </w:tc>
       </w:tr>
       <w:tr>
         <w:tc>
           <w:tcPr>
-            <w:tcW w:type="dxa" w:w="10368"/>
-            <w:gridSpan w:val="3"/>
+            <w:tcW w:type="dxa" w:w="9360"/>
+            <w:gridSpan w:val="2"/>
             <w:vAlign w:val="center"/>
             <w:shd w:val="clear" w:fill="DCE6F1"/>
           </w:tcPr>
@@ -5049,7 +3692,7 @@
       <w:tr>
         <w:tc>
           <w:tcPr>
-            <w:tcW w:type="dxa" w:w="5760"/>
+            <w:tcW w:type="dxa" w:w="8064"/>
             <w:vAlign w:val="center"/>
           </w:tcPr>
           <w:p>
@@ -5065,7 +3708,7 @@
         </w:tc>
         <w:tc>
           <w:tcPr>
-            <w:tcW w:type="dxa" w:w="1152"/>
+            <w:tcW w:type="dxa" w:w="1296"/>
             <w:vAlign w:val="center"/>
           </w:tcPr>
           <w:p>
@@ -5082,26 +3725,11 @@
             </w:r>
           </w:p>
         </w:tc>
-        <w:tc>
-          <w:tcPr>
-            <w:tcW w:type="dxa" w:w="3456"/>
-            <w:vAlign w:val="center"/>
-          </w:tcPr>
-          <w:p>
-            <w:r>
-              <w:rPr>
-                <w:b w:val="0"/>
-                <w:i w:val="0"/>
-                <w:sz w:val="18"/>
-              </w:rPr>
-            </w:r>
-          </w:p>
-        </w:tc>
       </w:tr>
       <w:tr>
         <w:tc>
           <w:tcPr>
-            <w:tcW w:type="dxa" w:w="5760"/>
+            <w:tcW w:type="dxa" w:w="8064"/>
             <w:vAlign w:val="center"/>
           </w:tcPr>
           <w:p>
@@ -5117,7 +3745,7 @@
         </w:tc>
         <w:tc>
           <w:tcPr>
-            <w:tcW w:type="dxa" w:w="1152"/>
+            <w:tcW w:type="dxa" w:w="1296"/>
             <w:vAlign w:val="center"/>
           </w:tcPr>
           <w:p>
@@ -5134,26 +3762,11 @@
             </w:r>
           </w:p>
         </w:tc>
-        <w:tc>
-          <w:tcPr>
-            <w:tcW w:type="dxa" w:w="3456"/>
-            <w:vAlign w:val="center"/>
-          </w:tcPr>
-          <w:p>
-            <w:r>
-              <w:rPr>
-                <w:b w:val="0"/>
-                <w:i w:val="0"/>
-                <w:sz w:val="18"/>
-              </w:rPr>
-            </w:r>
-          </w:p>
-        </w:tc>
       </w:tr>
       <w:tr>
         <w:tc>
           <w:tcPr>
-            <w:tcW w:type="dxa" w:w="5760"/>
+            <w:tcW w:type="dxa" w:w="8064"/>
             <w:vAlign w:val="center"/>
           </w:tcPr>
           <w:p>
@@ -5169,7 +3782,7 @@
         </w:tc>
         <w:tc>
           <w:tcPr>
-            <w:tcW w:type="dxa" w:w="1152"/>
+            <w:tcW w:type="dxa" w:w="1296"/>
             <w:vAlign w:val="center"/>
           </w:tcPr>
           <w:p>
@@ -5186,26 +3799,11 @@
             </w:r>
           </w:p>
         </w:tc>
-        <w:tc>
-          <w:tcPr>
-            <w:tcW w:type="dxa" w:w="3456"/>
-            <w:vAlign w:val="center"/>
-          </w:tcPr>
-          <w:p>
-            <w:r>
-              <w:rPr>
-                <w:b w:val="0"/>
-                <w:i w:val="0"/>
-                <w:sz w:val="18"/>
-              </w:rPr>
-            </w:r>
-          </w:p>
-        </w:tc>
       </w:tr>
       <w:tr>
         <w:tc>
           <w:tcPr>
-            <w:tcW w:type="dxa" w:w="5760"/>
+            <w:tcW w:type="dxa" w:w="8064"/>
             <w:vAlign w:val="center"/>
           </w:tcPr>
           <w:p>
@@ -5221,7 +3819,7 @@
         </w:tc>
         <w:tc>
           <w:tcPr>
-            <w:tcW w:type="dxa" w:w="1152"/>
+            <w:tcW w:type="dxa" w:w="1296"/>
             <w:vAlign w:val="center"/>
           </w:tcPr>
           <w:p>
@@ -5238,26 +3836,11 @@
             </w:r>
           </w:p>
         </w:tc>
-        <w:tc>
-          <w:tcPr>
-            <w:tcW w:type="dxa" w:w="3456"/>
-            <w:vAlign w:val="center"/>
-          </w:tcPr>
-          <w:p>
-            <w:r>
-              <w:rPr>
-                <w:b w:val="0"/>
-                <w:i w:val="0"/>
-                <w:sz w:val="18"/>
-              </w:rPr>
-            </w:r>
-          </w:p>
-        </w:tc>
       </w:tr>
       <w:tr>
         <w:tc>
           <w:tcPr>
-            <w:tcW w:type="dxa" w:w="5760"/>
+            <w:tcW w:type="dxa" w:w="8064"/>
             <w:vAlign w:val="center"/>
           </w:tcPr>
           <w:p>
@@ -5273,7 +3856,7 @@
         </w:tc>
         <w:tc>
           <w:tcPr>
-            <w:tcW w:type="dxa" w:w="1152"/>
+            <w:tcW w:type="dxa" w:w="1296"/>
             <w:vAlign w:val="center"/>
           </w:tcPr>
           <w:p>
@@ -5290,26 +3873,11 @@
             </w:r>
           </w:p>
         </w:tc>
-        <w:tc>
-          <w:tcPr>
-            <w:tcW w:type="dxa" w:w="3456"/>
-            <w:vAlign w:val="center"/>
-          </w:tcPr>
-          <w:p>
-            <w:r>
-              <w:rPr>
-                <w:b w:val="0"/>
-                <w:i w:val="0"/>
-                <w:sz w:val="18"/>
-              </w:rPr>
-            </w:r>
-          </w:p>
-        </w:tc>
       </w:tr>
       <w:tr>
         <w:tc>
           <w:tcPr>
-            <w:tcW w:type="dxa" w:w="5760"/>
+            <w:tcW w:type="dxa" w:w="8064"/>
             <w:vAlign w:val="center"/>
           </w:tcPr>
           <w:p>
@@ -5325,7 +3893,7 @@
         </w:tc>
         <w:tc>
           <w:tcPr>
-            <w:tcW w:type="dxa" w:w="1152"/>
+            <w:tcW w:type="dxa" w:w="1296"/>
             <w:vAlign w:val="center"/>
           </w:tcPr>
           <w:p>
@@ -5342,26 +3910,11 @@
             </w:r>
           </w:p>
         </w:tc>
-        <w:tc>
-          <w:tcPr>
-            <w:tcW w:type="dxa" w:w="3456"/>
-            <w:vAlign w:val="center"/>
-          </w:tcPr>
-          <w:p>
-            <w:r>
-              <w:rPr>
-                <w:b w:val="0"/>
-                <w:i w:val="0"/>
-                <w:sz w:val="18"/>
-              </w:rPr>
-            </w:r>
-          </w:p>
-        </w:tc>
       </w:tr>
       <w:tr>
         <w:tc>
           <w:tcPr>
-            <w:tcW w:type="dxa" w:w="5760"/>
+            <w:tcW w:type="dxa" w:w="8064"/>
             <w:vAlign w:val="center"/>
           </w:tcPr>
           <w:p>
@@ -5377,7 +3930,7 @@
         </w:tc>
         <w:tc>
           <w:tcPr>
-            <w:tcW w:type="dxa" w:w="1152"/>
+            <w:tcW w:type="dxa" w:w="1296"/>
             <w:vAlign w:val="center"/>
           </w:tcPr>
           <w:p>
@@ -5394,27 +3947,12 @@
             </w:r>
           </w:p>
         </w:tc>
-        <w:tc>
-          <w:tcPr>
-            <w:tcW w:type="dxa" w:w="3456"/>
-            <w:vAlign w:val="center"/>
-          </w:tcPr>
-          <w:p>
-            <w:r>
-              <w:rPr>
-                <w:b w:val="0"/>
-                <w:i w:val="0"/>
-                <w:sz w:val="18"/>
-              </w:rPr>
-            </w:r>
-          </w:p>
-        </w:tc>
       </w:tr>
       <w:tr>
         <w:tc>
           <w:tcPr>
-            <w:tcW w:type="dxa" w:w="10368"/>
-            <w:gridSpan w:val="3"/>
+            <w:tcW w:type="dxa" w:w="9360"/>
+            <w:gridSpan w:val="2"/>
             <w:vAlign w:val="center"/>
             <w:shd w:val="clear" w:fill="DCE6F1"/>
           </w:tcPr>
@@ -5434,7 +3972,7 @@
       <w:tr>
         <w:tc>
           <w:tcPr>
-            <w:tcW w:type="dxa" w:w="5760"/>
+            <w:tcW w:type="dxa" w:w="8064"/>
             <w:vAlign w:val="center"/>
           </w:tcPr>
           <w:p>
@@ -5450,7 +3988,7 @@
         </w:tc>
         <w:tc>
           <w:tcPr>
-            <w:tcW w:type="dxa" w:w="1152"/>
+            <w:tcW w:type="dxa" w:w="1296"/>
             <w:vAlign w:val="center"/>
           </w:tcPr>
           <w:p>
@@ -5467,26 +4005,11 @@
             </w:r>
           </w:p>
         </w:tc>
-        <w:tc>
-          <w:tcPr>
-            <w:tcW w:type="dxa" w:w="3456"/>
-            <w:vAlign w:val="center"/>
-          </w:tcPr>
-          <w:p>
-            <w:r>
-              <w:rPr>
-                <w:b w:val="0"/>
-                <w:i w:val="0"/>
-                <w:sz w:val="18"/>
-              </w:rPr>
-            </w:r>
-          </w:p>
-        </w:tc>
       </w:tr>
       <w:tr>
         <w:tc>
           <w:tcPr>
-            <w:tcW w:type="dxa" w:w="5760"/>
+            <w:tcW w:type="dxa" w:w="8064"/>
             <w:vAlign w:val="center"/>
           </w:tcPr>
           <w:p>
@@ -5502,7 +4025,7 @@
         </w:tc>
         <w:tc>
           <w:tcPr>
-            <w:tcW w:type="dxa" w:w="1152"/>
+            <w:tcW w:type="dxa" w:w="1296"/>
             <w:vAlign w:val="center"/>
           </w:tcPr>
           <w:p>
@@ -5519,26 +4042,11 @@
             </w:r>
           </w:p>
         </w:tc>
-        <w:tc>
-          <w:tcPr>
-            <w:tcW w:type="dxa" w:w="3456"/>
-            <w:vAlign w:val="center"/>
-          </w:tcPr>
-          <w:p>
-            <w:r>
-              <w:rPr>
-                <w:b w:val="0"/>
-                <w:i w:val="0"/>
-                <w:sz w:val="18"/>
-              </w:rPr>
-            </w:r>
-          </w:p>
-        </w:tc>
       </w:tr>
       <w:tr>
         <w:tc>
           <w:tcPr>
-            <w:tcW w:type="dxa" w:w="5760"/>
+            <w:tcW w:type="dxa" w:w="8064"/>
             <w:vAlign w:val="center"/>
           </w:tcPr>
           <w:p>
@@ -5554,7 +4062,7 @@
         </w:tc>
         <w:tc>
           <w:tcPr>
-            <w:tcW w:type="dxa" w:w="1152"/>
+            <w:tcW w:type="dxa" w:w="1296"/>
             <w:vAlign w:val="center"/>
           </w:tcPr>
           <w:p>
@@ -5571,27 +4079,12 @@
             </w:r>
           </w:p>
         </w:tc>
-        <w:tc>
-          <w:tcPr>
-            <w:tcW w:type="dxa" w:w="3456"/>
-            <w:vAlign w:val="center"/>
-          </w:tcPr>
-          <w:p>
-            <w:r>
-              <w:rPr>
-                <w:b w:val="0"/>
-                <w:i w:val="0"/>
-                <w:sz w:val="18"/>
-              </w:rPr>
-            </w:r>
-          </w:p>
-        </w:tc>
       </w:tr>
       <w:tr>
         <w:tc>
           <w:tcPr>
-            <w:tcW w:type="dxa" w:w="10368"/>
-            <w:gridSpan w:val="3"/>
+            <w:tcW w:type="dxa" w:w="9360"/>
+            <w:gridSpan w:val="2"/>
             <w:vAlign w:val="center"/>
             <w:shd w:val="clear" w:fill="DCE6F1"/>
           </w:tcPr>
@@ -5611,7 +4104,7 @@
       <w:tr>
         <w:tc>
           <w:tcPr>
-            <w:tcW w:type="dxa" w:w="5760"/>
+            <w:tcW w:type="dxa" w:w="8064"/>
             <w:vAlign w:val="center"/>
           </w:tcPr>
           <w:p>
@@ -5627,7 +4120,7 @@
         </w:tc>
         <w:tc>
           <w:tcPr>
-            <w:tcW w:type="dxa" w:w="1152"/>
+            <w:tcW w:type="dxa" w:w="1296"/>
             <w:vAlign w:val="center"/>
           </w:tcPr>
           <w:p>
@@ -5644,26 +4137,11 @@
             </w:r>
           </w:p>
         </w:tc>
-        <w:tc>
-          <w:tcPr>
-            <w:tcW w:type="dxa" w:w="3456"/>
-            <w:vAlign w:val="center"/>
-          </w:tcPr>
-          <w:p>
-            <w:r>
-              <w:rPr>
-                <w:b w:val="0"/>
-                <w:i w:val="0"/>
-                <w:sz w:val="18"/>
-              </w:rPr>
-            </w:r>
-          </w:p>
-        </w:tc>
       </w:tr>
       <w:tr>
         <w:tc>
           <w:tcPr>
-            <w:tcW w:type="dxa" w:w="5760"/>
+            <w:tcW w:type="dxa" w:w="8064"/>
             <w:vAlign w:val="center"/>
           </w:tcPr>
           <w:p>
@@ -5679,7 +4157,7 @@
         </w:tc>
         <w:tc>
           <w:tcPr>
-            <w:tcW w:type="dxa" w:w="1152"/>
+            <w:tcW w:type="dxa" w:w="1296"/>
             <w:vAlign w:val="center"/>
           </w:tcPr>
           <w:p>
@@ -5696,26 +4174,11 @@
             </w:r>
           </w:p>
         </w:tc>
-        <w:tc>
-          <w:tcPr>
-            <w:tcW w:type="dxa" w:w="3456"/>
-            <w:vAlign w:val="center"/>
-          </w:tcPr>
-          <w:p>
-            <w:r>
-              <w:rPr>
-                <w:b w:val="0"/>
-                <w:i w:val="0"/>
-                <w:sz w:val="18"/>
-              </w:rPr>
-            </w:r>
-          </w:p>
-        </w:tc>
       </w:tr>
       <w:tr>
         <w:tc>
           <w:tcPr>
-            <w:tcW w:type="dxa" w:w="5760"/>
+            <w:tcW w:type="dxa" w:w="8064"/>
             <w:vAlign w:val="center"/>
           </w:tcPr>
           <w:p>
@@ -5731,7 +4194,7 @@
         </w:tc>
         <w:tc>
           <w:tcPr>
-            <w:tcW w:type="dxa" w:w="1152"/>
+            <w:tcW w:type="dxa" w:w="1296"/>
             <w:vAlign w:val="center"/>
           </w:tcPr>
           <w:p>
@@ -5748,26 +4211,11 @@
             </w:r>
           </w:p>
         </w:tc>
-        <w:tc>
-          <w:tcPr>
-            <w:tcW w:type="dxa" w:w="3456"/>
-            <w:vAlign w:val="center"/>
-          </w:tcPr>
-          <w:p>
-            <w:r>
-              <w:rPr>
-                <w:b w:val="0"/>
-                <w:i w:val="0"/>
-                <w:sz w:val="18"/>
-              </w:rPr>
-            </w:r>
-          </w:p>
-        </w:tc>
       </w:tr>
       <w:tr>
         <w:tc>
           <w:tcPr>
-            <w:tcW w:type="dxa" w:w="5760"/>
+            <w:tcW w:type="dxa" w:w="8064"/>
             <w:vAlign w:val="center"/>
           </w:tcPr>
           <w:p>
@@ -5783,7 +4231,7 @@
         </w:tc>
         <w:tc>
           <w:tcPr>
-            <w:tcW w:type="dxa" w:w="1152"/>
+            <w:tcW w:type="dxa" w:w="1296"/>
             <w:vAlign w:val="center"/>
           </w:tcPr>
           <w:p>
@@ -5800,26 +4248,11 @@
             </w:r>
           </w:p>
         </w:tc>
-        <w:tc>
-          <w:tcPr>
-            <w:tcW w:type="dxa" w:w="3456"/>
-            <w:vAlign w:val="center"/>
-          </w:tcPr>
-          <w:p>
-            <w:r>
-              <w:rPr>
-                <w:b w:val="0"/>
-                <w:i w:val="0"/>
-                <w:sz w:val="18"/>
-              </w:rPr>
-            </w:r>
-          </w:p>
-        </w:tc>
       </w:tr>
       <w:tr>
         <w:tc>
           <w:tcPr>
-            <w:tcW w:type="dxa" w:w="5760"/>
+            <w:tcW w:type="dxa" w:w="8064"/>
             <w:vAlign w:val="center"/>
           </w:tcPr>
           <w:p>
@@ -5835,7 +4268,7 @@
         </w:tc>
         <w:tc>
           <w:tcPr>
-            <w:tcW w:type="dxa" w:w="1152"/>
+            <w:tcW w:type="dxa" w:w="1296"/>
             <w:vAlign w:val="center"/>
           </w:tcPr>
           <w:p>
@@ -5852,26 +4285,11 @@
             </w:r>
           </w:p>
         </w:tc>
-        <w:tc>
-          <w:tcPr>
-            <w:tcW w:type="dxa" w:w="3456"/>
-            <w:vAlign w:val="center"/>
-          </w:tcPr>
-          <w:p>
-            <w:r>
-              <w:rPr>
-                <w:b w:val="0"/>
-                <w:i w:val="0"/>
-                <w:sz w:val="18"/>
-              </w:rPr>
-            </w:r>
-          </w:p>
-        </w:tc>
       </w:tr>
       <w:tr>
         <w:tc>
           <w:tcPr>
-            <w:tcW w:type="dxa" w:w="5760"/>
+            <w:tcW w:type="dxa" w:w="8064"/>
             <w:vAlign w:val="center"/>
           </w:tcPr>
           <w:p>
@@ -5887,7 +4305,7 @@
         </w:tc>
         <w:tc>
           <w:tcPr>
-            <w:tcW w:type="dxa" w:w="1152"/>
+            <w:tcW w:type="dxa" w:w="1296"/>
             <w:vAlign w:val="center"/>
           </w:tcPr>
           <w:p>
@@ -5904,27 +4322,12 @@
             </w:r>
           </w:p>
         </w:tc>
-        <w:tc>
-          <w:tcPr>
-            <w:tcW w:type="dxa" w:w="3456"/>
-            <w:vAlign w:val="center"/>
-          </w:tcPr>
-          <w:p>
-            <w:r>
-              <w:rPr>
-                <w:b w:val="0"/>
-                <w:i w:val="0"/>
-                <w:sz w:val="18"/>
-              </w:rPr>
-            </w:r>
-          </w:p>
-        </w:tc>
       </w:tr>
       <w:tr>
         <w:tc>
           <w:tcPr>
-            <w:tcW w:type="dxa" w:w="10368"/>
-            <w:gridSpan w:val="3"/>
+            <w:tcW w:type="dxa" w:w="9360"/>
+            <w:gridSpan w:val="2"/>
             <w:vAlign w:val="center"/>
             <w:shd w:val="clear" w:fill="DCE6F1"/>
           </w:tcPr>
@@ -5944,7 +4347,7 @@
       <w:tr>
         <w:tc>
           <w:tcPr>
-            <w:tcW w:type="dxa" w:w="5760"/>
+            <w:tcW w:type="dxa" w:w="8064"/>
             <w:vAlign w:val="center"/>
           </w:tcPr>
           <w:p>
@@ -5954,13 +4357,13 @@
                 <w:i w:val="0"/>
                 <w:sz w:val="20"/>
               </w:rPr>
-              <w:t>Car Transponder</w:t>
+              <w:t>Car Transponder  (Transponder: 00000 13110 / 22830)</w:t>
             </w:r>
           </w:p>
         </w:tc>
         <w:tc>
           <w:tcPr>
-            <w:tcW w:type="dxa" w:w="1152"/>
+            <w:tcW w:type="dxa" w:w="1296"/>
             <w:vAlign w:val="center"/>
           </w:tcPr>
           <w:p>
@@ -5977,27 +4380,11 @@
             </w:r>
           </w:p>
         </w:tc>
-        <w:tc>
-          <w:tcPr>
-            <w:tcW w:type="dxa" w:w="3456"/>
-            <w:vAlign w:val="center"/>
-          </w:tcPr>
-          <w:p>
-            <w:r>
-              <w:rPr>
-                <w:b w:val="0"/>
-                <w:i w:val="0"/>
-                <w:sz w:val="18"/>
-              </w:rPr>
-              <w:t>Transponder: 00000 13110 / 22830</w:t>
-            </w:r>
-          </w:p>
-        </w:tc>
       </w:tr>
       <w:tr>
         <w:tc>
           <w:tcPr>
-            <w:tcW w:type="dxa" w:w="5760"/>
+            <w:tcW w:type="dxa" w:w="8064"/>
             <w:vAlign w:val="center"/>
           </w:tcPr>
           <w:p>
@@ -6007,13 +4394,13 @@
                 <w:i w:val="0"/>
                 <w:sz w:val="20"/>
               </w:rPr>
-              <w:t>Access card</w:t>
+              <w:t>Access card  (S/N 251,59677 / 098,00388)</w:t>
             </w:r>
           </w:p>
         </w:tc>
         <w:tc>
           <w:tcPr>
-            <w:tcW w:type="dxa" w:w="1152"/>
+            <w:tcW w:type="dxa" w:w="1296"/>
             <w:vAlign w:val="center"/>
           </w:tcPr>
           <w:p>
@@ -6030,27 +4417,11 @@
             </w:r>
           </w:p>
         </w:tc>
-        <w:tc>
-          <w:tcPr>
-            <w:tcW w:type="dxa" w:w="3456"/>
-            <w:vAlign w:val="center"/>
-          </w:tcPr>
-          <w:p>
-            <w:r>
-              <w:rPr>
-                <w:b w:val="0"/>
-                <w:i w:val="0"/>
-                <w:sz w:val="18"/>
-              </w:rPr>
-              <w:t>S/N 251,59677 / 098,00388</w:t>
-            </w:r>
-          </w:p>
-        </w:tc>
       </w:tr>
       <w:tr>
         <w:tc>
           <w:tcPr>
-            <w:tcW w:type="dxa" w:w="5760"/>
+            <w:tcW w:type="dxa" w:w="8064"/>
             <w:vAlign w:val="center"/>
           </w:tcPr>
           <w:p>
@@ -6060,13 +4431,13 @@
                 <w:i w:val="0"/>
                 <w:sz w:val="20"/>
               </w:rPr>
-              <w:t>Keys</w:t>
+              <w:t>Keys  (Grill Gate x2, Padlock x4, Main Door x3, Rooms Key x1 set, Mail box x1)</w:t>
             </w:r>
           </w:p>
         </w:tc>
         <w:tc>
           <w:tcPr>
-            <w:tcW w:type="dxa" w:w="1152"/>
+            <w:tcW w:type="dxa" w:w="1296"/>
             <w:vAlign w:val="center"/>
           </w:tcPr>
           <w:p>
@@ -6083,27 +4454,11 @@
             </w:r>
           </w:p>
         </w:tc>
-        <w:tc>
-          <w:tcPr>
-            <w:tcW w:type="dxa" w:w="3456"/>
-            <w:vAlign w:val="center"/>
-          </w:tcPr>
-          <w:p>
-            <w:r>
-              <w:rPr>
-                <w:b w:val="0"/>
-                <w:i w:val="0"/>
-                <w:sz w:val="18"/>
-              </w:rPr>
-              <w:t>Grill Gate x2, Padlock x4, Main Door x3, Rooms Key x1 set, Mail box x1</w:t>
-            </w:r>
-          </w:p>
-        </w:tc>
       </w:tr>
       <w:tr>
         <w:tc>
           <w:tcPr>
-            <w:tcW w:type="dxa" w:w="5760"/>
+            <w:tcW w:type="dxa" w:w="8064"/>
             <w:vAlign w:val="center"/>
           </w:tcPr>
           <w:p>
@@ -6113,13 +4468,13 @@
                 <w:i w:val="0"/>
                 <w:sz w:val="20"/>
               </w:rPr>
-              <w:t>Controllers</w:t>
+              <w:t>Controllers  (York Aircond Controller x4, Panasonic Ceiling Fan Controller x5, Chunghop Universal remote x1, FANCO remote controller x1, Philips TV remote controller x1)</w:t>
             </w:r>
           </w:p>
         </w:tc>
         <w:tc>
           <w:tcPr>
-            <w:tcW w:type="dxa" w:w="1152"/>
+            <w:tcW w:type="dxa" w:w="1296"/>
             <w:vAlign w:val="center"/>
           </w:tcPr>
           <w:p>
@@ -6136,28 +4491,12 @@
             </w:r>
           </w:p>
         </w:tc>
-        <w:tc>
-          <w:tcPr>
-            <w:tcW w:type="dxa" w:w="3456"/>
-            <w:vAlign w:val="center"/>
-          </w:tcPr>
-          <w:p>
-            <w:r>
-              <w:rPr>
-                <w:b w:val="0"/>
-                <w:i w:val="0"/>
-                <w:sz w:val="18"/>
-              </w:rPr>
-              <w:t>York Aircond Controller x4, Panasonic Ceiling Fan Controller x5, Chunghop Universal remote x1, FANCO remote controller x1, Philips TV remote controller x1</w:t>
-            </w:r>
-          </w:p>
-        </w:tc>
       </w:tr>
       <w:tr>
         <w:tc>
           <w:tcPr>
-            <w:tcW w:type="dxa" w:w="10368"/>
-            <w:gridSpan w:val="3"/>
+            <w:tcW w:type="dxa" w:w="9360"/>
+            <w:gridSpan w:val="2"/>
             <w:vAlign w:val="center"/>
             <w:shd w:val="clear" w:fill="DCE6F1"/>
           </w:tcPr>
@@ -6177,7 +4516,7 @@
       <w:tr>
         <w:tc>
           <w:tcPr>
-            <w:tcW w:type="dxa" w:w="5760"/>
+            <w:tcW w:type="dxa" w:w="8064"/>
             <w:vAlign w:val="center"/>
           </w:tcPr>
           <w:p>
@@ -6187,13 +4526,13 @@
                 <w:i w:val="0"/>
                 <w:sz w:val="20"/>
               </w:rPr>
-              <w:t>Electric Meter Reading</w:t>
+              <w:t>Electric Meter Reading: 0049308</w:t>
             </w:r>
           </w:p>
         </w:tc>
         <w:tc>
           <w:tcPr>
-            <w:tcW w:type="dxa" w:w="1152"/>
+            <w:tcW w:type="dxa" w:w="1296"/>
             <w:vAlign w:val="center"/>
           </w:tcPr>
           <w:p>
@@ -6209,27 +4548,11 @@
             </w:r>
           </w:p>
         </w:tc>
-        <w:tc>
-          <w:tcPr>
-            <w:tcW w:type="dxa" w:w="3456"/>
-            <w:vAlign w:val="center"/>
-          </w:tcPr>
-          <w:p>
-            <w:r>
-              <w:rPr>
-                <w:b w:val="0"/>
-                <w:i w:val="0"/>
-                <w:sz w:val="18"/>
-              </w:rPr>
-              <w:t>0049308</w:t>
-            </w:r>
-          </w:p>
-        </w:tc>
       </w:tr>
       <w:tr>
         <w:tc>
           <w:tcPr>
-            <w:tcW w:type="dxa" w:w="5760"/>
+            <w:tcW w:type="dxa" w:w="8064"/>
             <w:vAlign w:val="center"/>
           </w:tcPr>
           <w:p>
@@ -6239,13 +4562,13 @@
                 <w:i w:val="0"/>
                 <w:sz w:val="20"/>
               </w:rPr>
-              <w:t>Water Meter Reading</w:t>
+              <w:t>Water Meter Reading: 06012660</w:t>
             </w:r>
           </w:p>
         </w:tc>
         <w:tc>
           <w:tcPr>
-            <w:tcW w:type="dxa" w:w="1152"/>
+            <w:tcW w:type="dxa" w:w="1296"/>
             <w:vAlign w:val="center"/>
           </w:tcPr>
           <w:p>
@@ -6261,27 +4584,11 @@
             </w:r>
           </w:p>
         </w:tc>
-        <w:tc>
-          <w:tcPr>
-            <w:tcW w:type="dxa" w:w="3456"/>
-            <w:vAlign w:val="center"/>
-          </w:tcPr>
-          <w:p>
-            <w:r>
-              <w:rPr>
-                <w:b w:val="0"/>
-                <w:i w:val="0"/>
-                <w:sz w:val="18"/>
-              </w:rPr>
-              <w:t>06012660</w:t>
-            </w:r>
-          </w:p>
-        </w:tc>
       </w:tr>
       <w:tr>
         <w:tc>
           <w:tcPr>
-            <w:tcW w:type="dxa" w:w="5760"/>
+            <w:tcW w:type="dxa" w:w="8064"/>
             <w:vAlign w:val="center"/>
           </w:tcPr>
           <w:p>
@@ -6291,13 +4598,13 @@
                 <w:i w:val="0"/>
                 <w:sz w:val="20"/>
               </w:rPr>
-              <w:t>Gas Meter Reading</w:t>
+              <w:t>Gas Meter Reading: 00607165</w:t>
             </w:r>
           </w:p>
         </w:tc>
         <w:tc>
           <w:tcPr>
-            <w:tcW w:type="dxa" w:w="1152"/>
+            <w:tcW w:type="dxa" w:w="1296"/>
             <w:vAlign w:val="center"/>
           </w:tcPr>
           <w:p>
@@ -6310,22 +4617,6 @@
                 <w:i w:val="0"/>
                 <w:sz w:val="20"/>
               </w:rPr>
-            </w:r>
-          </w:p>
-        </w:tc>
-        <w:tc>
-          <w:tcPr>
-            <w:tcW w:type="dxa" w:w="3456"/>
-            <w:vAlign w:val="center"/>
-          </w:tcPr>
-          <w:p>
-            <w:r>
-              <w:rPr>
-                <w:b w:val="0"/>
-                <w:i w:val="0"/>
-                <w:sz w:val="18"/>
-              </w:rPr>
-              <w:t>00607165</w:t>
             </w:r>
           </w:p>
         </w:tc>

</xml_diff>